<commit_message>
Update resume data, skills, portfolio, and sidebar with AI focus
- Sync experience.json with updated resume (AI workflows, expanded tech stack)
- Add AI & Automation skills category; update Back-End/Front-End versions
- Add School Keepsake to portfolio
- Add AI & Automation title to sidebar
- Update About Me text to highlight AI/automation focus

Co-Authored-By: Claude Sonnet 4.6 <noreply@anthropic.com>
</commit_message>
<xml_diff>
--- a/public/resume/Resume_AlexUlogov.docx
+++ b/public/resume/Resume_AlexUlogov.docx
@@ -1,31 +1,31 @@
 
 <file path=word/document.xml><?xml version="1.0" encoding="utf-8"?>
-<w:document xmlns:wpc="http://schemas.microsoft.com/office/word/2010/wordprocessingCanvas" xmlns:cx="http://schemas.microsoft.com/office/drawing/2014/chartex" xmlns:cx1="http://schemas.microsoft.com/office/drawing/2015/9/8/chartex" xmlns:cx2="http://schemas.microsoft.com/office/drawing/2015/10/21/chartex" xmlns:cx3="http://schemas.microsoft.com/office/drawing/2016/5/9/chartex" xmlns:cx4="http://schemas.microsoft.com/office/drawing/2016/5/10/chartex" xmlns:cx5="http://schemas.microsoft.com/office/drawing/2016/5/11/chartex" xmlns:cx6="http://schemas.microsoft.com/office/drawing/2016/5/12/chartex" xmlns:cx7="http://schemas.microsoft.com/office/drawing/2016/5/13/chartex" xmlns:cx8="http://schemas.microsoft.com/office/drawing/2016/5/14/chartex" xmlns:mc="http://schemas.openxmlformats.org/markup-compatibility/2006" xmlns:aink="http://schemas.microsoft.com/office/drawing/2016/ink" xmlns:am3d="http://schemas.microsoft.com/office/drawing/2017/model3d" xmlns:o="urn:schemas-microsoft-com:office:office" xmlns:oel="http://schemas.microsoft.com/office/2019/extlst" xmlns:r="http://schemas.openxmlformats.org/officeDocument/2006/relationships" xmlns:m="http://schemas.openxmlformats.org/officeDocument/2006/math" xmlns:v="urn:schemas-microsoft-com:vml" xmlns:wp14="http://schemas.microsoft.com/office/word/2010/wordprocessingDrawing" xmlns:wp="http://schemas.openxmlformats.org/drawingml/2006/wordprocessingDrawing" xmlns:w10="urn:schemas-microsoft-com:office:word" xmlns:w="http://schemas.openxmlformats.org/wordprocessingml/2006/main" xmlns:w14="http://schemas.microsoft.com/office/word/2010/wordml" xmlns:w15="http://schemas.microsoft.com/office/word/2012/wordml" xmlns:w16cex="http://schemas.microsoft.com/office/word/2018/wordml/cex" xmlns:w16cid="http://schemas.microsoft.com/office/word/2016/wordml/cid" xmlns:w16="http://schemas.microsoft.com/office/word/2018/wordml" xmlns:w16sdtdh="http://schemas.microsoft.com/office/word/2020/wordml/sdtdatahash" xmlns:w16se="http://schemas.microsoft.com/office/word/2015/wordml/symex" xmlns:wpg="http://schemas.microsoft.com/office/word/2010/wordprocessingGroup" xmlns:wpi="http://schemas.microsoft.com/office/word/2010/wordprocessingInk" xmlns:wne="http://schemas.microsoft.com/office/word/2006/wordml" xmlns:wps="http://schemas.microsoft.com/office/word/2010/wordprocessingShape" mc:Ignorable="w14 w15 w16se w16cid w16 w16cex w16sdtdh wp14">
+<w:document xmlns:wpc="http://schemas.microsoft.com/office/word/2010/wordprocessingCanvas" xmlns:cx="http://schemas.microsoft.com/office/drawing/2014/chartex" xmlns:cx1="http://schemas.microsoft.com/office/drawing/2015/9/8/chartex" xmlns:cx2="http://schemas.microsoft.com/office/drawing/2015/10/21/chartex" xmlns:cx3="http://schemas.microsoft.com/office/drawing/2016/5/9/chartex" xmlns:cx4="http://schemas.microsoft.com/office/drawing/2016/5/10/chartex" xmlns:cx5="http://schemas.microsoft.com/office/drawing/2016/5/11/chartex" xmlns:cx6="http://schemas.microsoft.com/office/drawing/2016/5/12/chartex" xmlns:cx7="http://schemas.microsoft.com/office/drawing/2016/5/13/chartex" xmlns:cx8="http://schemas.microsoft.com/office/drawing/2016/5/14/chartex" xmlns:mc="http://schemas.openxmlformats.org/markup-compatibility/2006" xmlns:aink="http://schemas.microsoft.com/office/drawing/2016/ink" xmlns:am3d="http://schemas.microsoft.com/office/drawing/2017/model3d" xmlns:o="urn:schemas-microsoft-com:office:office" xmlns:oel="http://schemas.microsoft.com/office/2019/extlst" xmlns:r="http://schemas.openxmlformats.org/officeDocument/2006/relationships" xmlns:m="http://schemas.openxmlformats.org/officeDocument/2006/math" xmlns:v="urn:schemas-microsoft-com:vml" xmlns:wp14="http://schemas.microsoft.com/office/word/2010/wordprocessingDrawing" xmlns:wp="http://schemas.openxmlformats.org/drawingml/2006/wordprocessingDrawing" xmlns:w10="urn:schemas-microsoft-com:office:word" xmlns:w="http://schemas.openxmlformats.org/wordprocessingml/2006/main" xmlns:w14="http://schemas.microsoft.com/office/word/2010/wordml" xmlns:w15="http://schemas.microsoft.com/office/word/2012/wordml" xmlns:w16cex="http://schemas.microsoft.com/office/word/2018/wordml/cex" xmlns:w16cid="http://schemas.microsoft.com/office/word/2016/wordml/cid" xmlns:w16="http://schemas.microsoft.com/office/word/2018/wordml" xmlns:w16du="http://schemas.microsoft.com/office/word/2023/wordml/word16du" xmlns:w16sdtdh="http://schemas.microsoft.com/office/word/2020/wordml/sdtdatahash" xmlns:w16sdtfl="http://schemas.microsoft.com/office/word/2024/wordml/sdtformatlock" xmlns:w16se="http://schemas.microsoft.com/office/word/2015/wordml/symex" xmlns:wpg="http://schemas.microsoft.com/office/word/2010/wordprocessingGroup" xmlns:wpi="http://schemas.microsoft.com/office/word/2010/wordprocessingInk" xmlns:wne="http://schemas.microsoft.com/office/word/2006/wordml" xmlns:wps="http://schemas.microsoft.com/office/word/2010/wordprocessingShape" mc:Ignorable="w14 w15 w16se w16cid w16 w16cex w16sdtdh w16sdtfl w16du wp14">
   <w:body>
     <w:tbl>
       <w:tblPr>
         <w:tblStyle w:val="TableGrid"/>
-        <w:tblW w:w="12249" w:type="dxa"/>
+        <w:tblW w:w="12256" w:type="dxa"/>
         <w:tblInd w:w="-1445" w:type="dxa"/>
         <w:tblCellMar>
-          <w:top w:w="360" w:type="dxa"/>
+          <w:top w:w="144" w:type="dxa"/>
           <w:left w:w="360" w:type="dxa"/>
-          <w:bottom w:w="360" w:type="dxa"/>
+          <w:bottom w:w="144" w:type="dxa"/>
           <w:right w:w="360" w:type="dxa"/>
         </w:tblCellMar>
         <w:tblLook w:val="04A0" w:firstRow="1" w:lastRow="0" w:firstColumn="1" w:lastColumn="0" w:noHBand="0" w:noVBand="1"/>
       </w:tblPr>
       <w:tblGrid>
-        <w:gridCol w:w="7925"/>
-        <w:gridCol w:w="4324"/>
+        <w:gridCol w:w="8758"/>
+        <w:gridCol w:w="3498"/>
       </w:tblGrid>
       <w:tr>
         <w:trPr>
-          <w:trHeight w:val="432"/>
+          <w:trHeight w:val="20"/>
         </w:trPr>
         <w:tc>
           <w:tcPr>
-            <w:tcW w:w="12249" w:type="dxa"/>
+            <w:tcW w:w="12256" w:type="dxa"/>
             <w:gridSpan w:val="2"/>
             <w:tcBorders>
               <w:top w:val="nil"/>
@@ -72,7 +72,7 @@
                 <w:sz w:val="28"/>
                 <w:szCs w:val="28"/>
               </w:rPr>
-              <w:t xml:space="preserve">Full Stack </w:t>
+              <w:t>Laravel Developer</w:t>
             </w:r>
             <w:r>
               <w:rPr>
@@ -81,7 +81,7 @@
                 <w:sz w:val="28"/>
                 <w:szCs w:val="28"/>
               </w:rPr>
-              <w:t>PHP</w:t>
+              <w:t xml:space="preserve"> | </w:t>
             </w:r>
             <w:r>
               <w:rPr>
@@ -90,7 +90,7 @@
                 <w:sz w:val="28"/>
                 <w:szCs w:val="28"/>
               </w:rPr>
-              <w:t xml:space="preserve"> Developer</w:t>
+              <w:t>Full Stack PHP Developer</w:t>
             </w:r>
             <w:r>
               <w:rPr>
@@ -99,18 +99,27 @@
                 <w:sz w:val="28"/>
                 <w:szCs w:val="28"/>
               </w:rPr>
-              <w:t xml:space="preserve"> | Laravel Developer</w:t>
+              <w:t xml:space="preserve"> | </w:t>
+            </w:r>
+            <w:r>
+              <w:rPr>
+                <w:rFonts w:cstheme="minorHAnsi"/>
+                <w:color w:val="FFFFFF" w:themeColor="background1"/>
+                <w:sz w:val="28"/>
+                <w:szCs w:val="28"/>
+              </w:rPr>
+              <w:t>AI &amp; Automation</w:t>
             </w:r>
           </w:p>
         </w:tc>
       </w:tr>
       <w:tr>
         <w:trPr>
-          <w:trHeight w:val="13329"/>
+          <w:trHeight w:val="13609"/>
         </w:trPr>
         <w:tc>
           <w:tcPr>
-            <w:tcW w:w="7925" w:type="dxa"/>
+            <w:tcW w:w="8759" w:type="dxa"/>
             <w:tcBorders>
               <w:top w:val="nil"/>
               <w:bottom w:val="nil"/>
@@ -119,7 +128,8 @@
           </w:tcPr>
           <w:p>
             <w:pPr>
-              <w:spacing w:after="240"/>
+              <w:spacing w:after="120"/>
+              <w:ind w:left="-90" w:right="-180"/>
               <w:jc w:val="both"/>
               <w:rPr>
                 <w:rFonts w:cstheme="minorHAnsi"/>
@@ -129,94 +139,7 @@
               <w:rPr>
                 <w:rFonts w:cstheme="minorHAnsi"/>
               </w:rPr>
-              <w:t xml:space="preserve">I am a </w:t>
-            </w:r>
-            <w:r>
-              <w:rPr>
-                <w:rFonts w:cstheme="minorHAnsi"/>
-              </w:rPr>
-              <w:t>F</w:t>
-            </w:r>
-            <w:r>
-              <w:rPr>
-                <w:rFonts w:cstheme="minorHAnsi"/>
-              </w:rPr>
-              <w:t xml:space="preserve">ull </w:t>
-            </w:r>
-            <w:r>
-              <w:rPr>
-                <w:rFonts w:cstheme="minorHAnsi"/>
-              </w:rPr>
-              <w:t>S</w:t>
-            </w:r>
-            <w:r>
-              <w:rPr>
-                <w:rFonts w:cstheme="minorHAnsi"/>
-              </w:rPr>
-              <w:t xml:space="preserve">tack </w:t>
-            </w:r>
-            <w:r>
-              <w:rPr>
-                <w:rFonts w:cstheme="minorHAnsi"/>
-              </w:rPr>
-              <w:t>PHP D</w:t>
-            </w:r>
-            <w:r>
-              <w:rPr>
-                <w:rFonts w:cstheme="minorHAnsi"/>
-              </w:rPr>
-              <w:t xml:space="preserve">eveloper with </w:t>
-            </w:r>
-            <w:r>
-              <w:rPr>
-                <w:rFonts w:cstheme="minorHAnsi"/>
-              </w:rPr>
-              <w:t>over</w:t>
-            </w:r>
-            <w:r>
-              <w:rPr>
-                <w:rFonts w:cstheme="minorHAnsi"/>
-              </w:rPr>
-              <w:t xml:space="preserve"> fifteen years of hands-on experience. I have a strong background in web development and have worked on a wide range of projects</w:t>
-            </w:r>
-            <w:r>
-              <w:rPr>
-                <w:rFonts w:cstheme="minorHAnsi"/>
-              </w:rPr>
-              <w:t>,</w:t>
-            </w:r>
-            <w:r>
-              <w:rPr>
-                <w:rFonts w:cstheme="minorHAnsi"/>
-              </w:rPr>
-              <w:t xml:space="preserve"> from simple websites to complex web applications.</w:t>
-            </w:r>
-          </w:p>
-          <w:p>
-            <w:pPr>
-              <w:spacing w:after="240"/>
-              <w:jc w:val="both"/>
-              <w:rPr>
-                <w:rFonts w:cstheme="minorHAnsi"/>
-              </w:rPr>
-            </w:pPr>
-            <w:r>
-              <w:rPr>
-                <w:rFonts w:cstheme="minorHAnsi"/>
-              </w:rPr>
-              <w:t xml:space="preserve">I am a self-motivated, hard-working, and goal-oriented person. I </w:t>
-            </w:r>
-            <w:r>
-              <w:rPr>
-                <w:rFonts w:cstheme="minorHAnsi"/>
-              </w:rPr>
-              <w:t>can</w:t>
-            </w:r>
-            <w:r>
-              <w:rPr>
-                <w:rFonts w:cstheme="minorHAnsi"/>
-              </w:rPr>
-              <w:t xml:space="preserve"> work independently and as part of a team.</w:t>
+              <w:t>Experienced Laravel and Full Stack PHP Developer with 15+ years of hands-on experience building web applications, business systems, and custom software solutions. Strong background in Laravel, PHP, MySQL, Vue.js, and modern web development practices. Recently focused on AI integrations, automation, AI-assisted workflows, and intelligent business tools using LLM APIs and modern AI technologies. Able to work independently or as part of a team to deliver scalable and maintainable solutions.</w:t>
             </w:r>
           </w:p>
           <w:p>
@@ -224,6 +147,7 @@
               <w:pBdr>
                 <w:bottom w:val="single" w:sz="4" w:space="1" w:color="auto"/>
               </w:pBdr>
+              <w:ind w:right="-180"/>
               <w:rPr>
                 <w:rFonts w:cstheme="minorHAnsi"/>
                 <w:b/>
@@ -246,8 +170,12 @@
           <w:p>
             <w:pPr>
               <w:spacing w:before="120" w:after="120"/>
-              <w:rPr>
-                <w:rFonts w:cstheme="minorHAnsi"/>
+              <w:ind w:right="-180"/>
+              <w:rPr>
+                <w:rFonts w:cstheme="minorHAnsi"/>
+                <w:i/>
+                <w:iCs/>
+                <w:u w:val="single"/>
               </w:rPr>
             </w:pPr>
             <w:r>
@@ -255,44 +183,23 @@
                 <w:rFonts w:cstheme="minorHAnsi"/>
                 <w:b/>
                 <w:bCs/>
-              </w:rPr>
-              <w:t>20</w:t>
+                <w:u w:val="single"/>
+              </w:rPr>
+              <w:t>2023 –</w:t>
             </w:r>
             <w:r>
               <w:rPr>
                 <w:rFonts w:cstheme="minorHAnsi"/>
                 <w:b/>
                 <w:bCs/>
-              </w:rPr>
-              <w:t>2</w:t>
-            </w:r>
-            <w:r>
-              <w:rPr>
-                <w:rFonts w:cstheme="minorHAnsi"/>
-                <w:b/>
-                <w:bCs/>
-              </w:rPr>
-              <w:t>3 –</w:t>
-            </w:r>
-            <w:r>
-              <w:rPr>
-                <w:rFonts w:cstheme="minorHAnsi"/>
-                <w:b/>
-                <w:bCs/>
-              </w:rPr>
-              <w:t xml:space="preserve"> </w:t>
-            </w:r>
-            <w:r>
-              <w:rPr>
-                <w:rFonts w:cstheme="minorHAnsi"/>
-                <w:b/>
-                <w:bCs/>
-              </w:rPr>
-              <w:t>Present</w:t>
-            </w:r>
-            <w:r>
-              <w:rPr>
-                <w:rFonts w:cstheme="minorHAnsi"/>
+                <w:u w:val="single"/>
+              </w:rPr>
+              <w:t xml:space="preserve"> Present</w:t>
+            </w:r>
+            <w:r>
+              <w:rPr>
+                <w:rFonts w:cstheme="minorHAnsi"/>
+                <w:u w:val="single"/>
               </w:rPr>
               <w:t> </w:t>
             </w:r>
@@ -301,6 +208,7 @@
             <w:r>
               <w:rPr>
                 <w:rFonts w:cstheme="minorHAnsi"/>
+                <w:u w:val="single"/>
               </w:rPr>
               <w:t xml:space="preserve">· </w:t>
             </w:r>
@@ -309,20 +217,23 @@
             <w:r>
               <w:rPr>
                 <w:rFonts w:cstheme="minorHAnsi"/>
+                <w:u w:val="single"/>
               </w:rPr>
               <w:t>Leonard’s Photography</w:t>
             </w:r>
             <w:r>
               <w:rPr>
                 <w:rFonts w:cstheme="minorHAnsi"/>
-              </w:rPr>
-              <w:br/>
+                <w:u w:val="single"/>
+              </w:rPr>
+              <w:t xml:space="preserve"> · </w:t>
             </w:r>
             <w:r>
               <w:rPr>
                 <w:rFonts w:cstheme="minorHAnsi"/>
                 <w:i/>
                 <w:iCs/>
+                <w:u w:val="single"/>
               </w:rPr>
               <w:t xml:space="preserve">Full Stack </w:t>
             </w:r>
@@ -332,6 +243,7 @@
                 <w:rFonts w:cstheme="minorHAnsi"/>
                 <w:i/>
                 <w:iCs/>
+                <w:u w:val="single"/>
               </w:rPr>
               <w:t>PHP</w:t>
             </w:r>
@@ -341,6 +253,7 @@
                 <w:rFonts w:cstheme="minorHAnsi"/>
                 <w:i/>
                 <w:iCs/>
+                <w:u w:val="single"/>
               </w:rPr>
               <w:t xml:space="preserve"> </w:t>
             </w:r>
@@ -350,6 +263,7 @@
                 <w:rFonts w:cstheme="minorHAnsi"/>
                 <w:i/>
                 <w:iCs/>
+                <w:u w:val="single"/>
               </w:rPr>
               <w:t>Developer</w:t>
             </w:r>
@@ -359,6 +273,7 @@
                 <w:rFonts w:cstheme="minorHAnsi"/>
                 <w:i/>
                 <w:iCs/>
+                <w:u w:val="single"/>
               </w:rPr>
               <w:t>, Laravel Developer</w:t>
             </w:r>
@@ -368,38 +283,31 @@
               <w:pStyle w:val="ListParagraph"/>
               <w:numPr>
                 <w:ilvl w:val="0"/>
-                <w:numId w:val="7"/>
+                <w:numId w:val="10"/>
               </w:numPr>
               <w:spacing w:before="120" w:after="120"/>
+              <w:ind w:left="630" w:right="-180"/>
               <w:jc w:val="both"/>
               <w:rPr>
                 <w:rFonts w:cstheme="minorHAnsi"/>
               </w:rPr>
             </w:pPr>
-            <w:bookmarkStart w:id="4" w:name="_Hlk123933695"/>
-            <w:r>
-              <w:rPr>
-                <w:rFonts w:cstheme="minorHAnsi"/>
-              </w:rPr>
-              <w:t xml:space="preserve">Maintain multiple company's sites, develop new </w:t>
-            </w:r>
-            <w:proofErr w:type="gramStart"/>
-            <w:r>
-              <w:rPr>
-                <w:rFonts w:cstheme="minorHAnsi"/>
-              </w:rPr>
-              <w:t>features</w:t>
-            </w:r>
-            <w:proofErr w:type="gramEnd"/>
+            <w:r>
+              <w:rPr>
+                <w:rFonts w:cstheme="minorHAnsi"/>
+              </w:rPr>
+              <w:t xml:space="preserve">Maintained and developed company websites and Laravel-based web applications </w:t>
+            </w:r>
           </w:p>
           <w:p>
             <w:pPr>
               <w:pStyle w:val="ListParagraph"/>
               <w:numPr>
                 <w:ilvl w:val="0"/>
-                <w:numId w:val="7"/>
+                <w:numId w:val="10"/>
               </w:numPr>
               <w:spacing w:before="120" w:after="120"/>
+              <w:ind w:left="630" w:right="-180"/>
               <w:jc w:val="both"/>
               <w:rPr>
                 <w:rFonts w:cstheme="minorHAnsi"/>
@@ -409,7 +317,7 @@
               <w:rPr>
                 <w:rFonts w:cstheme="minorHAnsi"/>
               </w:rPr>
-              <w:t>Code refactoring, migration from MySQL stored procedures to Laravel Models</w:t>
+              <w:t xml:space="preserve">Refactored and migrated legacy systems from MySQL stored procedures, C#, and VB to modern Laravel architecture </w:t>
             </w:r>
           </w:p>
           <w:p>
@@ -417,9 +325,10 @@
               <w:pStyle w:val="ListParagraph"/>
               <w:numPr>
                 <w:ilvl w:val="0"/>
-                <w:numId w:val="7"/>
+                <w:numId w:val="10"/>
               </w:numPr>
               <w:spacing w:before="120" w:after="120"/>
+              <w:ind w:left="630" w:right="-180"/>
               <w:jc w:val="both"/>
               <w:rPr>
                 <w:rFonts w:cstheme="minorHAnsi"/>
@@ -429,25 +338,18 @@
               <w:rPr>
                 <w:rFonts w:cstheme="minorHAnsi"/>
               </w:rPr>
-              <w:t xml:space="preserve">Work with large MySQL databases, optimize </w:t>
-            </w:r>
-            <w:proofErr w:type="gramStart"/>
-            <w:r>
-              <w:rPr>
-                <w:rFonts w:cstheme="minorHAnsi"/>
-              </w:rPr>
-              <w:t>queries</w:t>
-            </w:r>
-            <w:proofErr w:type="gramEnd"/>
+              <w:t xml:space="preserve">Worked with large MySQL databases and optimized complex queries and application performance </w:t>
+            </w:r>
           </w:p>
           <w:p>
             <w:pPr>
               <w:pStyle w:val="ListParagraph"/>
               <w:numPr>
                 <w:ilvl w:val="0"/>
-                <w:numId w:val="7"/>
+                <w:numId w:val="10"/>
               </w:numPr>
-              <w:spacing w:before="120" w:after="120" w:line="259" w:lineRule="auto"/>
+              <w:spacing w:before="120" w:after="120"/>
+              <w:ind w:left="630" w:right="-180"/>
               <w:jc w:val="both"/>
               <w:rPr>
                 <w:rFonts w:cstheme="minorHAnsi"/>
@@ -457,102 +359,7 @@
               <w:rPr>
                 <w:rFonts w:cstheme="minorHAnsi"/>
               </w:rPr>
-              <w:t>Tech stack. Front-End: Vue 2, JavaScript, jQuery, Bootstrap 4, Tailwind; Back-End: PHP 7, Laravel 8, MySQL, C#</w:t>
-            </w:r>
-            <w:bookmarkStart w:id="5" w:name="_Hlk141819412"/>
-          </w:p>
-          <w:p>
-            <w:pPr>
-              <w:spacing w:before="120" w:after="120"/>
-              <w:ind w:left="360"/>
-              <w:jc w:val="both"/>
-              <w:rPr>
-                <w:rFonts w:cstheme="minorHAnsi"/>
-              </w:rPr>
-            </w:pPr>
-          </w:p>
-          <w:bookmarkEnd w:id="4"/>
-          <w:bookmarkEnd w:id="5"/>
-          <w:p>
-            <w:pPr>
-              <w:spacing w:before="120" w:after="120"/>
-              <w:rPr>
-                <w:rFonts w:cstheme="minorHAnsi"/>
-              </w:rPr>
-            </w:pPr>
-            <w:r>
-              <w:rPr>
-                <w:rFonts w:cstheme="minorHAnsi"/>
-                <w:b/>
-                <w:bCs/>
-              </w:rPr>
-              <w:t>20</w:t>
-            </w:r>
-            <w:r>
-              <w:rPr>
-                <w:rFonts w:cstheme="minorHAnsi"/>
-                <w:b/>
-                <w:bCs/>
-              </w:rPr>
-              <w:t>2</w:t>
-            </w:r>
-            <w:r>
-              <w:rPr>
-                <w:rFonts w:cstheme="minorHAnsi"/>
-                <w:b/>
-                <w:bCs/>
-              </w:rPr>
-              <w:t>3 –</w:t>
-            </w:r>
-            <w:r>
-              <w:rPr>
-                <w:rFonts w:cstheme="minorHAnsi"/>
-                <w:b/>
-                <w:bCs/>
-              </w:rPr>
-              <w:t xml:space="preserve"> </w:t>
-            </w:r>
-            <w:r>
-              <w:rPr>
-                <w:rFonts w:cstheme="minorHAnsi"/>
-                <w:b/>
-                <w:bCs/>
-              </w:rPr>
-              <w:t>Present</w:t>
-            </w:r>
-            <w:r>
-              <w:rPr>
-                <w:rFonts w:cstheme="minorHAnsi"/>
-              </w:rPr>
-              <w:t xml:space="preserve"> · </w:t>
-            </w:r>
-            <w:r>
-              <w:rPr>
-                <w:rFonts w:cstheme="minorHAnsi"/>
-              </w:rPr>
-              <w:t>Magicore Academy</w:t>
-            </w:r>
-            <w:r>
-              <w:rPr>
-                <w:rFonts w:cstheme="minorHAnsi"/>
-              </w:rPr>
-              <w:br/>
-            </w:r>
-            <w:r>
-              <w:rPr>
-                <w:rFonts w:cstheme="minorHAnsi"/>
-                <w:i/>
-                <w:iCs/>
-              </w:rPr>
-              <w:t>Full Stack PHP Developer</w:t>
-            </w:r>
-            <w:r>
-              <w:rPr>
-                <w:rFonts w:cstheme="minorHAnsi"/>
-                <w:i/>
-                <w:iCs/>
-              </w:rPr>
-              <w:t>, Laravel Developer</w:t>
+              <w:t xml:space="preserve">Built AI-assisted workflows using LLM APIs, prompt engineering, vector search, embeddings, and retrieval-based systems </w:t>
             </w:r>
           </w:p>
           <w:p>
@@ -560,9 +367,10 @@
               <w:pStyle w:val="ListParagraph"/>
               <w:numPr>
                 <w:ilvl w:val="0"/>
-                <w:numId w:val="7"/>
+                <w:numId w:val="10"/>
               </w:numPr>
-              <w:spacing w:before="120" w:after="120" w:line="259" w:lineRule="auto"/>
+              <w:spacing w:before="120" w:after="120"/>
+              <w:ind w:left="630" w:right="-180"/>
               <w:jc w:val="both"/>
               <w:rPr>
                 <w:rFonts w:cstheme="minorHAnsi"/>
@@ -572,31 +380,7 @@
               <w:rPr>
                 <w:rFonts w:cstheme="minorHAnsi"/>
               </w:rPr>
-              <w:t xml:space="preserve">Discuss </w:t>
-            </w:r>
-            <w:r>
-              <w:rPr>
-                <w:rFonts w:cstheme="minorHAnsi"/>
-              </w:rPr>
-              <w:t xml:space="preserve">employer’s </w:t>
-            </w:r>
-            <w:r>
-              <w:rPr>
-                <w:rFonts w:cstheme="minorHAnsi"/>
-              </w:rPr>
-              <w:t xml:space="preserve">business needs and develop custom web </w:t>
-            </w:r>
-            <w:r>
-              <w:rPr>
-                <w:rFonts w:cstheme="minorHAnsi"/>
-              </w:rPr>
-              <w:t>solutions</w:t>
-            </w:r>
-            <w:r>
-              <w:rPr>
-                <w:rFonts w:cstheme="minorHAnsi"/>
-              </w:rPr>
-              <w:t>.</w:t>
+              <w:t xml:space="preserve">Researched and implemented AI features to improve automation, search experience, and business workflows </w:t>
             </w:r>
           </w:p>
           <w:p>
@@ -604,9 +388,10 @@
               <w:pStyle w:val="ListParagraph"/>
               <w:numPr>
                 <w:ilvl w:val="0"/>
-                <w:numId w:val="7"/>
+                <w:numId w:val="10"/>
               </w:numPr>
-              <w:spacing w:before="120" w:after="120" w:line="259" w:lineRule="auto"/>
+              <w:spacing w:before="120" w:after="120"/>
+              <w:ind w:left="630" w:right="-180"/>
               <w:jc w:val="both"/>
               <w:rPr>
                 <w:rFonts w:cstheme="minorHAnsi"/>
@@ -616,13 +401,7 @@
               <w:rPr>
                 <w:rFonts w:cstheme="minorHAnsi"/>
               </w:rPr>
-              <w:t>Code refactoring to comply with Laravel best practices</w:t>
-            </w:r>
-            <w:r>
-              <w:rPr>
-                <w:rFonts w:cstheme="minorHAnsi"/>
-              </w:rPr>
-              <w:t>.</w:t>
+              <w:t xml:space="preserve">Integrated third-party APIs including Google, Twilio, Mailchimp, OpenAI, and others </w:t>
             </w:r>
           </w:p>
           <w:p>
@@ -630,9 +409,31 @@
               <w:pStyle w:val="ListParagraph"/>
               <w:numPr>
                 <w:ilvl w:val="0"/>
-                <w:numId w:val="7"/>
+                <w:numId w:val="10"/>
+              </w:numPr>
+              <w:spacing w:before="120" w:after="120"/>
+              <w:ind w:left="630" w:right="-180"/>
+              <w:jc w:val="both"/>
+              <w:rPr>
+                <w:rFonts w:cstheme="minorHAnsi"/>
+              </w:rPr>
+            </w:pPr>
+            <w:r>
+              <w:rPr>
+                <w:rFonts w:cstheme="minorHAnsi"/>
+              </w:rPr>
+              <w:t>Performed code reviews and provided technical guidance for junior developers</w:t>
+            </w:r>
+          </w:p>
+          <w:p>
+            <w:pPr>
+              <w:pStyle w:val="ListParagraph"/>
+              <w:numPr>
+                <w:ilvl w:val="1"/>
+                <w:numId w:val="9"/>
               </w:numPr>
               <w:spacing w:before="120" w:after="120" w:line="259" w:lineRule="auto"/>
+              <w:ind w:left="1080" w:right="-180"/>
               <w:jc w:val="both"/>
               <w:rPr>
                 <w:rFonts w:cstheme="minorHAnsi"/>
@@ -642,7 +443,105 @@
               <w:rPr>
                 <w:rFonts w:cstheme="minorHAnsi"/>
               </w:rPr>
-              <w:t>Develop and maintain the site's admin, teacher, and student sections.</w:t>
+              <w:t>Front-End: Vue 2/3, JavaScript, jQuery, Bootstrap 4/5, Tailwind CSS</w:t>
+            </w:r>
+          </w:p>
+          <w:p>
+            <w:pPr>
+              <w:pStyle w:val="ListParagraph"/>
+              <w:numPr>
+                <w:ilvl w:val="1"/>
+                <w:numId w:val="9"/>
+              </w:numPr>
+              <w:spacing w:before="120" w:after="120" w:line="259" w:lineRule="auto"/>
+              <w:ind w:left="1080" w:right="-180"/>
+              <w:jc w:val="both"/>
+              <w:rPr>
+                <w:rFonts w:cstheme="minorHAnsi"/>
+              </w:rPr>
+            </w:pPr>
+            <w:r>
+              <w:rPr>
+                <w:rFonts w:cstheme="minorHAnsi"/>
+              </w:rPr>
+              <w:t>Back-End: PHP 7/8, Laravel 7/8/11</w:t>
+            </w:r>
+            <w:r>
+              <w:rPr>
+                <w:rFonts w:cstheme="minorHAnsi"/>
+              </w:rPr>
+              <w:t>/12/13</w:t>
+            </w:r>
+            <w:r>
+              <w:rPr>
+                <w:rFonts w:cstheme="minorHAnsi"/>
+              </w:rPr>
+              <w:t>, MySQL, C#</w:t>
+            </w:r>
+          </w:p>
+          <w:p>
+            <w:pPr>
+              <w:pStyle w:val="ListParagraph"/>
+              <w:numPr>
+                <w:ilvl w:val="1"/>
+                <w:numId w:val="9"/>
+              </w:numPr>
+              <w:spacing w:before="120" w:after="120" w:line="259" w:lineRule="auto"/>
+              <w:ind w:left="1080" w:right="-180"/>
+              <w:jc w:val="both"/>
+              <w:rPr>
+                <w:rFonts w:cstheme="minorHAnsi"/>
+              </w:rPr>
+            </w:pPr>
+            <w:r>
+              <w:rPr>
+                <w:rFonts w:cstheme="minorHAnsi"/>
+              </w:rPr>
+              <w:t>Other: Git, GitLab, Jira, Slack, LAMP, Debian, Node.js</w:t>
+            </w:r>
+          </w:p>
+          <w:p>
+            <w:pPr>
+              <w:spacing w:before="120" w:after="120"/>
+              <w:ind w:right="-180"/>
+              <w:rPr>
+                <w:rFonts w:cstheme="minorHAnsi"/>
+                <w:i/>
+                <w:iCs/>
+                <w:u w:val="single"/>
+              </w:rPr>
+            </w:pPr>
+            <w:r>
+              <w:rPr>
+                <w:rFonts w:cstheme="minorHAnsi"/>
+                <w:b/>
+                <w:bCs/>
+                <w:u w:val="single"/>
+              </w:rPr>
+              <w:t>2023 – Present</w:t>
+            </w:r>
+            <w:r>
+              <w:rPr>
+                <w:rFonts w:cstheme="minorHAnsi"/>
+                <w:u w:val="single"/>
+              </w:rPr>
+              <w:t> · Magicore Academy</w:t>
+            </w:r>
+            <w:r>
+              <w:rPr>
+                <w:rFonts w:cstheme="minorHAnsi"/>
+                <w:u w:val="single"/>
+              </w:rPr>
+              <w:t xml:space="preserve"> · </w:t>
+            </w:r>
+            <w:r>
+              <w:rPr>
+                <w:rFonts w:cstheme="minorHAnsi"/>
+                <w:i/>
+                <w:iCs/>
+                <w:u w:val="single"/>
+              </w:rPr>
+              <w:t>Full Stack PHP Developer, Laravel Developer</w:t>
             </w:r>
           </w:p>
           <w:p>
@@ -650,9 +549,10 @@
               <w:pStyle w:val="ListParagraph"/>
               <w:numPr>
                 <w:ilvl w:val="0"/>
-                <w:numId w:val="7"/>
+                <w:numId w:val="10"/>
               </w:numPr>
-              <w:spacing w:before="120" w:after="120" w:line="259" w:lineRule="auto"/>
+              <w:spacing w:before="120" w:after="120"/>
+              <w:ind w:left="630" w:right="-180"/>
               <w:jc w:val="both"/>
               <w:rPr>
                 <w:rFonts w:cstheme="minorHAnsi"/>
@@ -662,19 +562,19 @@
               <w:rPr>
                 <w:rFonts w:cstheme="minorHAnsi"/>
               </w:rPr>
-              <w:t xml:space="preserve">API Integration with Stripe (subscription model), and integration with </w:t>
-            </w:r>
-            <w:r>
-              <w:rPr>
-                <w:rFonts w:cstheme="minorHAnsi"/>
-              </w:rPr>
-              <w:t>Articulate - Storyline 360</w:t>
-            </w:r>
-            <w:r>
-              <w:rPr>
-                <w:rFonts w:cstheme="minorHAnsi"/>
-              </w:rPr>
-              <w:t>.</w:t>
+              <w:t xml:space="preserve">Collaborated with the </w:t>
+            </w:r>
+            <w:r>
+              <w:rPr>
+                <w:rFonts w:cstheme="minorHAnsi"/>
+              </w:rPr>
+              <w:t>business owners</w:t>
+            </w:r>
+            <w:r>
+              <w:rPr>
+                <w:rFonts w:cstheme="minorHAnsi"/>
+              </w:rPr>
+              <w:t xml:space="preserve"> to understand business needs and develop custom web solutions.</w:t>
             </w:r>
           </w:p>
           <w:p>
@@ -682,9 +582,10 @@
               <w:pStyle w:val="ListParagraph"/>
               <w:numPr>
                 <w:ilvl w:val="0"/>
-                <w:numId w:val="7"/>
+                <w:numId w:val="10"/>
               </w:numPr>
-              <w:spacing w:before="120" w:after="120" w:line="259" w:lineRule="auto"/>
+              <w:spacing w:before="120" w:after="120"/>
+              <w:ind w:left="630" w:right="-180"/>
               <w:jc w:val="both"/>
               <w:rPr>
                 <w:rFonts w:cstheme="minorHAnsi"/>
@@ -694,81 +595,7 @@
               <w:rPr>
                 <w:rFonts w:cstheme="minorHAnsi"/>
               </w:rPr>
-              <w:t>Tech s</w:t>
-            </w:r>
-            <w:r>
-              <w:rPr>
-                <w:rFonts w:cstheme="minorHAnsi"/>
-              </w:rPr>
-              <w:t>tack</w:t>
-            </w:r>
-            <w:r>
-              <w:rPr>
-                <w:rFonts w:cstheme="minorHAnsi"/>
-              </w:rPr>
-              <w:t>.</w:t>
-            </w:r>
-            <w:r>
-              <w:rPr>
-                <w:rFonts w:cstheme="minorHAnsi"/>
-              </w:rPr>
-              <w:t xml:space="preserve"> Front-End: JavaScript, jQuery, Bootstrap 5, Laravel Blade</w:t>
-            </w:r>
-            <w:r>
-              <w:rPr>
-                <w:rFonts w:cstheme="minorHAnsi"/>
-              </w:rPr>
-              <w:t xml:space="preserve">; </w:t>
-            </w:r>
-            <w:r>
-              <w:rPr>
-                <w:rFonts w:cstheme="minorHAnsi"/>
-              </w:rPr>
-              <w:t>Back-End: PHP 8, Laravel 8, MySQL, LAMP.</w:t>
-            </w:r>
-          </w:p>
-          <w:p>
-            <w:pPr>
-              <w:spacing w:after="120"/>
-              <w:rPr>
-                <w:rFonts w:cstheme="minorHAnsi"/>
-              </w:rPr>
-            </w:pPr>
-          </w:p>
-          <w:p>
-            <w:pPr>
-              <w:spacing w:before="120" w:after="120"/>
-              <w:rPr>
-                <w:rFonts w:cstheme="minorHAnsi"/>
-              </w:rPr>
-            </w:pPr>
-            <w:r>
-              <w:rPr>
-                <w:rFonts w:cstheme="minorHAnsi"/>
-                <w:b/>
-                <w:bCs/>
-              </w:rPr>
-              <w:t>2003 – 2023</w:t>
-            </w:r>
-            <w:r>
-              <w:rPr>
-                <w:rFonts w:cstheme="minorHAnsi"/>
-              </w:rPr>
-              <w:t> · Self-Employed</w:t>
-            </w:r>
-            <w:r>
-              <w:rPr>
-                <w:rFonts w:cstheme="minorHAnsi"/>
-              </w:rPr>
-              <w:br/>
-            </w:r>
-            <w:r>
-              <w:rPr>
-                <w:rFonts w:cstheme="minorHAnsi"/>
-                <w:i/>
-                <w:iCs/>
-              </w:rPr>
-              <w:t>Full Stack PHP Developer</w:t>
+              <w:t>Refactored code to comply with Laravel best practices and migrated to the latest Laravel version.</w:t>
             </w:r>
           </w:p>
           <w:p>
@@ -776,9 +603,10 @@
               <w:pStyle w:val="ListParagraph"/>
               <w:numPr>
                 <w:ilvl w:val="0"/>
-                <w:numId w:val="7"/>
+                <w:numId w:val="10"/>
               </w:numPr>
-              <w:spacing w:before="120" w:after="120" w:line="259" w:lineRule="auto"/>
+              <w:spacing w:before="120" w:after="120"/>
+              <w:ind w:left="630" w:right="-180"/>
               <w:jc w:val="both"/>
               <w:rPr>
                 <w:rFonts w:cstheme="minorHAnsi"/>
@@ -788,7 +616,7 @@
               <w:rPr>
                 <w:rFonts w:cstheme="minorHAnsi"/>
               </w:rPr>
-              <w:t>Discuss clients’ business needs and develop custom web solutions.</w:t>
+              <w:t>Developed and maintained the site's admin, teacher, and student sections.</w:t>
             </w:r>
           </w:p>
           <w:p>
@@ -796,9 +624,10 @@
               <w:pStyle w:val="ListParagraph"/>
               <w:numPr>
                 <w:ilvl w:val="0"/>
-                <w:numId w:val="7"/>
+                <w:numId w:val="10"/>
               </w:numPr>
-              <w:spacing w:before="120" w:after="120" w:line="259" w:lineRule="auto"/>
+              <w:spacing w:before="120" w:after="120"/>
+              <w:ind w:left="630" w:right="-180"/>
               <w:jc w:val="both"/>
               <w:rPr>
                 <w:rFonts w:cstheme="minorHAnsi"/>
@@ -808,7 +637,25 @@
               <w:rPr>
                 <w:rFonts w:cstheme="minorHAnsi"/>
               </w:rPr>
-              <w:t>Develop and use my own framework.</w:t>
+              <w:t>Integrated APIs with Stripe (subscription model)</w:t>
+            </w:r>
+            <w:r>
+              <w:rPr>
+                <w:rFonts w:cstheme="minorHAnsi"/>
+              </w:rPr>
+              <w:t xml:space="preserve">, Clever, </w:t>
+            </w:r>
+            <w:r>
+              <w:rPr>
+                <w:rFonts w:cstheme="minorHAnsi"/>
+              </w:rPr>
+              <w:t>Articulate Storyline 360</w:t>
+            </w:r>
+            <w:r>
+              <w:rPr>
+                <w:rFonts w:cstheme="minorHAnsi"/>
+              </w:rPr>
+              <w:t xml:space="preserve"> and others.</w:t>
             </w:r>
           </w:p>
           <w:p>
@@ -816,9 +663,31 @@
               <w:pStyle w:val="ListParagraph"/>
               <w:numPr>
                 <w:ilvl w:val="0"/>
-                <w:numId w:val="7"/>
+                <w:numId w:val="10"/>
+              </w:numPr>
+              <w:spacing w:before="120" w:after="120"/>
+              <w:ind w:left="630" w:right="-180"/>
+              <w:jc w:val="both"/>
+              <w:rPr>
+                <w:rFonts w:cstheme="minorHAnsi"/>
+              </w:rPr>
+            </w:pPr>
+            <w:r>
+              <w:rPr>
+                <w:rFonts w:cstheme="minorHAnsi"/>
+              </w:rPr>
+              <w:t>Set up and maintained a Digital Ocean Ubuntu server with a LAMP stack</w:t>
+            </w:r>
+          </w:p>
+          <w:p>
+            <w:pPr>
+              <w:pStyle w:val="ListParagraph"/>
+              <w:numPr>
+                <w:ilvl w:val="1"/>
+                <w:numId w:val="9"/>
               </w:numPr>
               <w:spacing w:before="120" w:after="120" w:line="259" w:lineRule="auto"/>
+              <w:ind w:left="1080" w:right="-180"/>
               <w:jc w:val="both"/>
               <w:rPr>
                 <w:rFonts w:cstheme="minorHAnsi"/>
@@ -828,19 +697,100 @@
               <w:rPr>
                 <w:rFonts w:cstheme="minorHAnsi"/>
               </w:rPr>
-              <w:t xml:space="preserve">Work with </w:t>
-            </w:r>
-            <w:r>
-              <w:rPr>
-                <w:rFonts w:cstheme="minorHAnsi"/>
-              </w:rPr>
-              <w:t>web designers</w:t>
-            </w:r>
-            <w:r>
-              <w:rPr>
-                <w:rFonts w:cstheme="minorHAnsi"/>
-              </w:rPr>
-              <w:t>.</w:t>
+              <w:t>Front-End: JavaScript, jQuery, Bootstrap 5, Laravel Blade</w:t>
+            </w:r>
+            <w:r>
+              <w:rPr>
+                <w:rFonts w:cstheme="minorHAnsi"/>
+              </w:rPr>
+              <w:t xml:space="preserve"> -&gt; Vue 3,</w:t>
+            </w:r>
+          </w:p>
+          <w:p>
+            <w:pPr>
+              <w:pStyle w:val="ListParagraph"/>
+              <w:numPr>
+                <w:ilvl w:val="1"/>
+                <w:numId w:val="9"/>
+              </w:numPr>
+              <w:spacing w:before="120" w:after="120" w:line="259" w:lineRule="auto"/>
+              <w:ind w:left="1080" w:right="-180"/>
+              <w:jc w:val="both"/>
+              <w:rPr>
+                <w:rFonts w:cstheme="minorHAnsi"/>
+              </w:rPr>
+            </w:pPr>
+            <w:r>
+              <w:rPr>
+                <w:rFonts w:cstheme="minorHAnsi"/>
+              </w:rPr>
+              <w:t>Back-End: PHP 8, Laravel 8</w:t>
+            </w:r>
+            <w:r>
+              <w:rPr>
+                <w:rFonts w:cstheme="minorHAnsi"/>
+              </w:rPr>
+              <w:t>-&gt;</w:t>
+            </w:r>
+            <w:r>
+              <w:rPr>
+                <w:rFonts w:cstheme="minorHAnsi"/>
+              </w:rPr>
+              <w:t>1</w:t>
+            </w:r>
+            <w:r>
+              <w:rPr>
+                <w:rFonts w:cstheme="minorHAnsi"/>
+              </w:rPr>
+              <w:t>2</w:t>
+            </w:r>
+            <w:r>
+              <w:rPr>
+                <w:rFonts w:cstheme="minorHAnsi"/>
+              </w:rPr>
+              <w:t xml:space="preserve"> MySQL, LAMP</w:t>
+            </w:r>
+          </w:p>
+          <w:p>
+            <w:pPr>
+              <w:spacing w:before="120" w:after="120"/>
+              <w:ind w:right="-180"/>
+              <w:rPr>
+                <w:rFonts w:cstheme="minorHAnsi"/>
+                <w:u w:val="single"/>
+              </w:rPr>
+            </w:pPr>
+            <w:r>
+              <w:rPr>
+                <w:rFonts w:cstheme="minorHAnsi"/>
+                <w:b/>
+                <w:bCs/>
+                <w:u w:val="single"/>
+              </w:rPr>
+              <w:t>2003 – 2023</w:t>
+            </w:r>
+            <w:r>
+              <w:rPr>
+                <w:rFonts w:cstheme="minorHAnsi"/>
+                <w:u w:val="single"/>
+              </w:rPr>
+              <w:t> · Self-Employed</w:t>
+            </w:r>
+            <w:r>
+              <w:rPr>
+                <w:rFonts w:cstheme="minorHAnsi"/>
+                <w:u w:val="single"/>
+              </w:rPr>
+              <w:t xml:space="preserve"> · </w:t>
+            </w:r>
+            <w:r>
+              <w:rPr>
+                <w:rFonts w:cstheme="minorHAnsi"/>
+                <w:i/>
+                <w:iCs/>
+                <w:u w:val="single"/>
+              </w:rPr>
+              <w:t>Full Stack PHP Developer</w:t>
             </w:r>
           </w:p>
           <w:p>
@@ -848,9 +798,10 @@
               <w:pStyle w:val="ListParagraph"/>
               <w:numPr>
                 <w:ilvl w:val="0"/>
-                <w:numId w:val="7"/>
+                <w:numId w:val="10"/>
               </w:numPr>
-              <w:spacing w:before="120" w:after="120" w:line="259" w:lineRule="auto"/>
+              <w:spacing w:before="120" w:after="120"/>
+              <w:ind w:left="630" w:right="-180"/>
               <w:jc w:val="both"/>
               <w:rPr>
                 <w:rFonts w:cstheme="minorHAnsi"/>
@@ -860,7 +811,31 @@
               <w:rPr>
                 <w:rFonts w:cstheme="minorHAnsi"/>
               </w:rPr>
-              <w:t>Maintain and update websites.</w:t>
+              <w:t>Discuss</w:t>
+            </w:r>
+            <w:r>
+              <w:rPr>
+                <w:rFonts w:cstheme="minorHAnsi"/>
+              </w:rPr>
+              <w:t>ed</w:t>
+            </w:r>
+            <w:r>
+              <w:rPr>
+                <w:rFonts w:cstheme="minorHAnsi"/>
+              </w:rPr>
+              <w:t xml:space="preserve"> clients’ business needs and develop</w:t>
+            </w:r>
+            <w:r>
+              <w:rPr>
+                <w:rFonts w:cstheme="minorHAnsi"/>
+              </w:rPr>
+              <w:t>ed</w:t>
+            </w:r>
+            <w:r>
+              <w:rPr>
+                <w:rFonts w:cstheme="minorHAnsi"/>
+              </w:rPr>
+              <w:t xml:space="preserve"> custom web solutions</w:t>
             </w:r>
           </w:p>
           <w:p>
@@ -868,9 +843,10 @@
               <w:pStyle w:val="ListParagraph"/>
               <w:numPr>
                 <w:ilvl w:val="0"/>
-                <w:numId w:val="7"/>
+                <w:numId w:val="10"/>
               </w:numPr>
-              <w:spacing w:before="120" w:after="120" w:line="259" w:lineRule="auto"/>
+              <w:spacing w:before="120" w:after="120"/>
+              <w:ind w:left="630" w:right="-180"/>
               <w:jc w:val="both"/>
               <w:rPr>
                 <w:rFonts w:cstheme="minorHAnsi"/>
@@ -880,7 +856,31 @@
               <w:rPr>
                 <w:rFonts w:cstheme="minorHAnsi"/>
               </w:rPr>
-              <w:t>Generate dynamic business and accounting reports.</w:t>
+              <w:t>Develop</w:t>
+            </w:r>
+            <w:r>
+              <w:rPr>
+                <w:rFonts w:cstheme="minorHAnsi"/>
+              </w:rPr>
+              <w:t>ed</w:t>
+            </w:r>
+            <w:r>
+              <w:rPr>
+                <w:rFonts w:cstheme="minorHAnsi"/>
+              </w:rPr>
+              <w:t xml:space="preserve"> and use</w:t>
+            </w:r>
+            <w:r>
+              <w:rPr>
+                <w:rFonts w:cstheme="minorHAnsi"/>
+              </w:rPr>
+              <w:t>d</w:t>
+            </w:r>
+            <w:r>
+              <w:rPr>
+                <w:rFonts w:cstheme="minorHAnsi"/>
+              </w:rPr>
+              <w:t xml:space="preserve"> my own framework</w:t>
             </w:r>
           </w:p>
           <w:p>
@@ -888,9 +888,10 @@
               <w:pStyle w:val="ListParagraph"/>
               <w:numPr>
                 <w:ilvl w:val="0"/>
-                <w:numId w:val="7"/>
+                <w:numId w:val="10"/>
               </w:numPr>
-              <w:spacing w:before="120" w:after="120" w:line="259" w:lineRule="auto"/>
+              <w:spacing w:before="120" w:after="120"/>
+              <w:ind w:left="630" w:right="-180"/>
               <w:jc w:val="both"/>
               <w:rPr>
                 <w:rFonts w:cstheme="minorHAnsi"/>
@@ -900,110 +901,25 @@
               <w:rPr>
                 <w:rFonts w:cstheme="minorHAnsi"/>
               </w:rPr>
-              <w:t>Search engine optimization.</w:t>
-            </w:r>
-          </w:p>
-          <w:p>
-            <w:pPr>
-              <w:spacing w:after="120"/>
-              <w:rPr>
-                <w:rFonts w:cstheme="minorHAnsi"/>
-              </w:rPr>
-            </w:pPr>
-          </w:p>
-          <w:p>
-            <w:pPr>
-              <w:spacing w:after="120"/>
-              <w:rPr>
-                <w:rFonts w:cstheme="minorHAnsi"/>
-              </w:rPr>
-            </w:pPr>
-          </w:p>
-          <w:p>
-            <w:pPr>
-              <w:spacing w:after="120"/>
-              <w:rPr>
-                <w:rFonts w:cstheme="minorHAnsi"/>
-              </w:rPr>
-            </w:pPr>
-          </w:p>
-          <w:p>
-            <w:pPr>
-              <w:spacing w:after="120"/>
-              <w:rPr>
-                <w:rFonts w:cstheme="minorHAnsi"/>
-              </w:rPr>
-            </w:pPr>
-          </w:p>
-          <w:p>
-            <w:pPr>
-              <w:spacing w:after="120"/>
-              <w:rPr>
-                <w:rFonts w:cstheme="minorHAnsi"/>
-              </w:rPr>
-            </w:pPr>
-          </w:p>
-          <w:p>
-            <w:pPr>
-              <w:spacing w:after="120"/>
-              <w:rPr>
-                <w:rFonts w:cstheme="minorHAnsi"/>
-              </w:rPr>
-            </w:pPr>
-          </w:p>
-          <w:p>
-            <w:pPr>
-              <w:spacing w:after="120" w:line="259" w:lineRule="auto"/>
-              <w:rPr>
-                <w:rFonts w:cstheme="minorHAnsi"/>
-                <w:i/>
-                <w:iCs/>
-              </w:rPr>
-            </w:pPr>
-            <w:r>
-              <w:rPr>
-                <w:rFonts w:cstheme="minorHAnsi"/>
-                <w:b/>
-                <w:bCs/>
-              </w:rPr>
-              <w:lastRenderedPageBreak/>
-              <w:t>2007 – 2017</w:t>
-            </w:r>
-            <w:r>
-              <w:rPr>
-                <w:rFonts w:cstheme="minorHAnsi"/>
-              </w:rPr>
-              <w:t> · Online Plumbing Store Mirsanteh</w:t>
-            </w:r>
-            <w:r>
-              <w:rPr>
-                <w:rFonts w:cstheme="minorHAnsi"/>
-              </w:rPr>
-              <w:br/>
-            </w:r>
-            <w:r>
-              <w:rPr>
-                <w:rFonts w:cstheme="minorHAnsi"/>
-                <w:i/>
-                <w:iCs/>
-              </w:rPr>
-              <w:t xml:space="preserve">Full Stack </w:t>
-            </w:r>
-            <w:r>
-              <w:rPr>
-                <w:rFonts w:cstheme="minorHAnsi"/>
-                <w:i/>
-                <w:iCs/>
-              </w:rPr>
-              <w:t>PHP</w:t>
-            </w:r>
-            <w:r>
-              <w:rPr>
-                <w:rFonts w:cstheme="minorHAnsi"/>
-                <w:i/>
-                <w:iCs/>
-              </w:rPr>
-              <w:t xml:space="preserve"> Developer</w:t>
+              <w:t>Work</w:t>
+            </w:r>
+            <w:r>
+              <w:rPr>
+                <w:rFonts w:cstheme="minorHAnsi"/>
+              </w:rPr>
+              <w:t>ed</w:t>
+            </w:r>
+            <w:r>
+              <w:rPr>
+                <w:rFonts w:cstheme="minorHAnsi"/>
+              </w:rPr>
+              <w:t xml:space="preserve"> with </w:t>
+            </w:r>
+            <w:r>
+              <w:rPr>
+                <w:rFonts w:cstheme="minorHAnsi"/>
+              </w:rPr>
+              <w:t>web designers</w:t>
             </w:r>
           </w:p>
           <w:p>
@@ -1011,9 +927,10 @@
               <w:pStyle w:val="ListParagraph"/>
               <w:numPr>
                 <w:ilvl w:val="0"/>
-                <w:numId w:val="8"/>
+                <w:numId w:val="10"/>
               </w:numPr>
-              <w:spacing w:after="120"/>
+              <w:spacing w:before="120" w:after="120"/>
+              <w:ind w:left="630" w:right="-180"/>
               <w:jc w:val="both"/>
               <w:rPr>
                 <w:rFonts w:cstheme="minorHAnsi"/>
@@ -1023,37 +940,31 @@
               <w:rPr>
                 <w:rFonts w:cstheme="minorHAnsi"/>
               </w:rPr>
-              <w:t xml:space="preserve">Help to grow </w:t>
-            </w:r>
-            <w:r>
-              <w:rPr>
-                <w:rFonts w:cstheme="minorHAnsi"/>
-              </w:rPr>
-              <w:t xml:space="preserve">the </w:t>
-            </w:r>
-            <w:r>
-              <w:rPr>
-                <w:rFonts w:cstheme="minorHAnsi"/>
-              </w:rPr>
-              <w:t xml:space="preserve">business from </w:t>
-            </w:r>
-            <w:r>
-              <w:rPr>
-                <w:rFonts w:cstheme="minorHAnsi"/>
-              </w:rPr>
-              <w:t xml:space="preserve">a </w:t>
-            </w:r>
-            <w:r>
-              <w:rPr>
-                <w:rFonts w:cstheme="minorHAnsi"/>
-              </w:rPr>
-              <w:t>small brick-and-mortar plumbing store to one of the top three Russian online plumbing stores</w:t>
-            </w:r>
-            <w:r>
-              <w:rPr>
-                <w:rFonts w:cstheme="minorHAnsi"/>
-              </w:rPr>
-              <w:t>.</w:t>
+              <w:t>Maintain</w:t>
+            </w:r>
+            <w:r>
+              <w:rPr>
+                <w:rFonts w:cstheme="minorHAnsi"/>
+              </w:rPr>
+              <w:t>ed</w:t>
+            </w:r>
+            <w:r>
+              <w:rPr>
+                <w:rFonts w:cstheme="minorHAnsi"/>
+              </w:rPr>
+              <w:t xml:space="preserve"> and update</w:t>
+            </w:r>
+            <w:r>
+              <w:rPr>
+                <w:rFonts w:cstheme="minorHAnsi"/>
+              </w:rPr>
+              <w:t>d</w:t>
+            </w:r>
+            <w:r>
+              <w:rPr>
+                <w:rFonts w:cstheme="minorHAnsi"/>
+              </w:rPr>
+              <w:t xml:space="preserve"> websites</w:t>
             </w:r>
           </w:p>
           <w:p>
@@ -1061,38 +972,32 @@
               <w:pStyle w:val="ListParagraph"/>
               <w:numPr>
                 <w:ilvl w:val="0"/>
-                <w:numId w:val="8"/>
+                <w:numId w:val="10"/>
               </w:numPr>
-              <w:spacing w:after="120"/>
+              <w:spacing w:before="120" w:after="120"/>
+              <w:ind w:left="630" w:right="-180"/>
               <w:jc w:val="both"/>
               <w:rPr>
                 <w:rFonts w:cstheme="minorHAnsi"/>
               </w:rPr>
             </w:pPr>
-            <w:bookmarkStart w:id="6" w:name="_Hlk123933761"/>
-            <w:r>
-              <w:rPr>
-                <w:rFonts w:cstheme="minorHAnsi"/>
-              </w:rPr>
-              <w:t xml:space="preserve">Build </w:t>
-            </w:r>
-            <w:r>
-              <w:rPr>
-                <w:rFonts w:cstheme="minorHAnsi"/>
-              </w:rPr>
-              <w:t xml:space="preserve">a </w:t>
-            </w:r>
-            <w:r>
-              <w:rPr>
-                <w:rFonts w:cstheme="minorHAnsi"/>
-              </w:rPr>
-              <w:t>very complex online store from the ground up</w:t>
-            </w:r>
-            <w:r>
-              <w:rPr>
-                <w:rFonts w:cstheme="minorHAnsi"/>
-              </w:rPr>
-              <w:t>.</w:t>
+            <w:r>
+              <w:rPr>
+                <w:rFonts w:cstheme="minorHAnsi"/>
+              </w:rPr>
+              <w:t>Generate</w:t>
+            </w:r>
+            <w:r>
+              <w:rPr>
+                <w:rFonts w:cstheme="minorHAnsi"/>
+              </w:rPr>
+              <w:t>d</w:t>
+            </w:r>
+            <w:r>
+              <w:rPr>
+                <w:rFonts w:cstheme="minorHAnsi"/>
+              </w:rPr>
+              <w:t xml:space="preserve"> dynamic business and accounting reports</w:t>
             </w:r>
           </w:p>
           <w:p>
@@ -1100,38 +1005,82 @@
               <w:pStyle w:val="ListParagraph"/>
               <w:numPr>
                 <w:ilvl w:val="0"/>
-                <w:numId w:val="8"/>
+                <w:numId w:val="10"/>
               </w:numPr>
-              <w:spacing w:after="120"/>
+              <w:spacing w:before="120" w:after="120"/>
+              <w:ind w:left="630" w:right="-180"/>
               <w:jc w:val="both"/>
               <w:rPr>
                 <w:rFonts w:cstheme="minorHAnsi"/>
               </w:rPr>
             </w:pPr>
-            <w:bookmarkStart w:id="7" w:name="_Hlk123933883"/>
-            <w:r>
-              <w:rPr>
-                <w:rFonts w:cstheme="minorHAnsi"/>
-              </w:rPr>
-              <w:t xml:space="preserve">Build </w:t>
-            </w:r>
-            <w:r>
-              <w:rPr>
-                <w:rFonts w:cstheme="minorHAnsi"/>
-              </w:rPr>
-              <w:t>a</w:t>
-            </w:r>
-            <w:r>
-              <w:rPr>
-                <w:rFonts w:cstheme="minorHAnsi"/>
-              </w:rPr>
-              <w:t xml:space="preserve"> module to exchange data with accounting software</w:t>
-            </w:r>
-            <w:r>
-              <w:rPr>
-                <w:rFonts w:cstheme="minorHAnsi"/>
-              </w:rPr>
-              <w:t>.</w:t>
+            <w:r>
+              <w:rPr>
+                <w:rFonts w:cstheme="minorHAnsi"/>
+              </w:rPr>
+              <w:t>Search engine optimization</w:t>
+            </w:r>
+          </w:p>
+          <w:p>
+            <w:pPr>
+              <w:spacing w:after="120" w:line="259" w:lineRule="auto"/>
+              <w:ind w:left="-90" w:right="-180"/>
+              <w:rPr>
+                <w:rFonts w:cstheme="minorHAnsi"/>
+                <w:i/>
+                <w:iCs/>
+                <w:u w:val="single"/>
+              </w:rPr>
+            </w:pPr>
+            <w:r>
+              <w:rPr>
+                <w:rFonts w:cstheme="minorHAnsi"/>
+                <w:b/>
+                <w:bCs/>
+                <w:u w:val="single"/>
+              </w:rPr>
+              <w:t>2007 – 2017</w:t>
+            </w:r>
+            <w:r>
+              <w:rPr>
+                <w:rFonts w:cstheme="minorHAnsi"/>
+                <w:u w:val="single"/>
+              </w:rPr>
+              <w:t> · Online Plumbing Store Mirsanteh</w:t>
+            </w:r>
+            <w:r>
+              <w:rPr>
+                <w:rFonts w:cstheme="minorHAnsi"/>
+                <w:u w:val="single"/>
+              </w:rPr>
+              <w:t xml:space="preserve"> · </w:t>
+            </w:r>
+            <w:r>
+              <w:rPr>
+                <w:rFonts w:cstheme="minorHAnsi"/>
+                <w:i/>
+                <w:iCs/>
+                <w:u w:val="single"/>
+              </w:rPr>
+              <w:t xml:space="preserve">Full Stack </w:t>
+            </w:r>
+            <w:r>
+              <w:rPr>
+                <w:rFonts w:cstheme="minorHAnsi"/>
+                <w:i/>
+                <w:iCs/>
+                <w:u w:val="single"/>
+              </w:rPr>
+              <w:t>PHP</w:t>
+            </w:r>
+            <w:r>
+              <w:rPr>
+                <w:rFonts w:cstheme="minorHAnsi"/>
+                <w:i/>
+                <w:iCs/>
+                <w:u w:val="single"/>
+              </w:rPr>
+              <w:t xml:space="preserve"> Developer</w:t>
             </w:r>
           </w:p>
           <w:p>
@@ -1139,26 +1088,56 @@
               <w:pStyle w:val="ListParagraph"/>
               <w:numPr>
                 <w:ilvl w:val="0"/>
-                <w:numId w:val="8"/>
+                <w:numId w:val="10"/>
               </w:numPr>
-              <w:spacing w:after="120"/>
+              <w:spacing w:before="120" w:after="120"/>
+              <w:ind w:left="630" w:right="-180"/>
               <w:jc w:val="both"/>
               <w:rPr>
                 <w:rFonts w:cstheme="minorHAnsi"/>
               </w:rPr>
             </w:pPr>
-            <w:bookmarkStart w:id="8" w:name="_Hlk123934398"/>
-            <w:r>
-              <w:rPr>
-                <w:rFonts w:cstheme="minorHAnsi"/>
-              </w:rPr>
-              <w:t>Create dynamically generated business reports</w:t>
-            </w:r>
-            <w:r>
-              <w:rPr>
-                <w:rFonts w:cstheme="minorHAnsi"/>
-              </w:rPr>
-              <w:t>.</w:t>
+            <w:r>
+              <w:rPr>
+                <w:rFonts w:cstheme="minorHAnsi"/>
+              </w:rPr>
+              <w:t>Help</w:t>
+            </w:r>
+            <w:r>
+              <w:rPr>
+                <w:rFonts w:cstheme="minorHAnsi"/>
+              </w:rPr>
+              <w:t>ed</w:t>
+            </w:r>
+            <w:r>
+              <w:rPr>
+                <w:rFonts w:cstheme="minorHAnsi"/>
+              </w:rPr>
+              <w:t xml:space="preserve"> to grow </w:t>
+            </w:r>
+            <w:r>
+              <w:rPr>
+                <w:rFonts w:cstheme="minorHAnsi"/>
+              </w:rPr>
+              <w:t xml:space="preserve">the </w:t>
+            </w:r>
+            <w:r>
+              <w:rPr>
+                <w:rFonts w:cstheme="minorHAnsi"/>
+              </w:rPr>
+              <w:t xml:space="preserve">business from </w:t>
+            </w:r>
+            <w:r>
+              <w:rPr>
+                <w:rFonts w:cstheme="minorHAnsi"/>
+              </w:rPr>
+              <w:t xml:space="preserve">a </w:t>
+            </w:r>
+            <w:r>
+              <w:rPr>
+                <w:rFonts w:cstheme="minorHAnsi"/>
+              </w:rPr>
+              <w:t>small brick-and-mortar plumbing store to one of the top three Russian online plumbing stores</w:t>
             </w:r>
           </w:p>
           <w:p>
@@ -1166,242 +1145,150 @@
               <w:pStyle w:val="ListParagraph"/>
               <w:numPr>
                 <w:ilvl w:val="0"/>
-                <w:numId w:val="8"/>
+                <w:numId w:val="10"/>
               </w:numPr>
-              <w:spacing w:after="120"/>
+              <w:spacing w:before="120" w:after="120"/>
+              <w:ind w:left="630" w:right="-180"/>
               <w:jc w:val="both"/>
               <w:rPr>
                 <w:rFonts w:cstheme="minorHAnsi"/>
               </w:rPr>
             </w:pPr>
-            <w:r>
-              <w:rPr>
-                <w:rFonts w:cstheme="minorHAnsi"/>
-              </w:rPr>
-              <w:t>Troubleshoot and resolve technical issues</w:t>
-            </w:r>
-            <w:r>
-              <w:rPr>
-                <w:rFonts w:cstheme="minorHAnsi"/>
-              </w:rPr>
-              <w:t>.</w:t>
-            </w:r>
-          </w:p>
-          <w:bookmarkEnd w:id="7"/>
-          <w:bookmarkEnd w:id="8"/>
+            <w:bookmarkStart w:id="4" w:name="_Hlk123933761"/>
+            <w:r>
+              <w:rPr>
+                <w:rFonts w:cstheme="minorHAnsi"/>
+              </w:rPr>
+              <w:t>Buil</w:t>
+            </w:r>
+            <w:r>
+              <w:rPr>
+                <w:rFonts w:cstheme="minorHAnsi"/>
+              </w:rPr>
+              <w:t>t</w:t>
+            </w:r>
+            <w:r>
+              <w:rPr>
+                <w:rFonts w:cstheme="minorHAnsi"/>
+              </w:rPr>
+              <w:t xml:space="preserve"> </w:t>
+            </w:r>
+            <w:r>
+              <w:rPr>
+                <w:rFonts w:cstheme="minorHAnsi"/>
+              </w:rPr>
+              <w:t xml:space="preserve">a </w:t>
+            </w:r>
+            <w:r>
+              <w:rPr>
+                <w:rFonts w:cstheme="minorHAnsi"/>
+              </w:rPr>
+              <w:t>very complex online store from the ground up</w:t>
+            </w:r>
+          </w:p>
           <w:p>
             <w:pPr>
               <w:pStyle w:val="ListParagraph"/>
               <w:numPr>
                 <w:ilvl w:val="0"/>
-                <w:numId w:val="8"/>
+                <w:numId w:val="10"/>
               </w:numPr>
-              <w:spacing w:after="120"/>
+              <w:spacing w:before="120" w:after="120"/>
+              <w:ind w:left="630" w:right="-180"/>
               <w:jc w:val="both"/>
               <w:rPr>
                 <w:rFonts w:cstheme="minorHAnsi"/>
               </w:rPr>
             </w:pPr>
-            <w:r>
-              <w:rPr>
-                <w:rFonts w:cstheme="minorHAnsi"/>
-              </w:rPr>
-              <w:t>Work with SEO and advertising agencies</w:t>
-            </w:r>
-            <w:r>
-              <w:rPr>
-                <w:rFonts w:cstheme="minorHAnsi"/>
-              </w:rPr>
-              <w:t>.</w:t>
-            </w:r>
-          </w:p>
-          <w:bookmarkEnd w:id="6"/>
-          <w:p>
-            <w:pPr>
-              <w:pStyle w:val="ListParagraph"/>
-              <w:spacing w:after="120"/>
-              <w:jc w:val="both"/>
-              <w:rPr>
-                <w:rFonts w:cstheme="minorHAnsi"/>
-              </w:rPr>
-            </w:pPr>
-          </w:p>
-          <w:p>
-            <w:pPr>
-              <w:spacing w:after="120"/>
-              <w:rPr>
-                <w:rFonts w:cstheme="minorHAnsi"/>
-              </w:rPr>
-            </w:pPr>
-            <w:r>
-              <w:rPr>
-                <w:rFonts w:cstheme="minorHAnsi"/>
-                <w:b/>
-                <w:bCs/>
-              </w:rPr>
-              <w:t>2003 – 2006</w:t>
-            </w:r>
-            <w:r>
-              <w:rPr>
-                <w:rFonts w:cstheme="minorHAnsi"/>
-              </w:rPr>
-              <w:t> · Online Toy Store Neopod</w:t>
-            </w:r>
-            <w:r>
-              <w:rPr>
-                <w:rFonts w:cstheme="minorHAnsi"/>
-              </w:rPr>
-              <w:br/>
-            </w:r>
-            <w:r>
-              <w:rPr>
-                <w:rFonts w:cstheme="minorHAnsi"/>
-                <w:i/>
-                <w:iCs/>
-              </w:rPr>
-              <w:t>Full Stack Web Developer</w:t>
-            </w:r>
-          </w:p>
+            <w:bookmarkStart w:id="5" w:name="_Hlk123933883"/>
+            <w:r>
+              <w:rPr>
+                <w:rFonts w:cstheme="minorHAnsi"/>
+              </w:rPr>
+              <w:t>Buil</w:t>
+            </w:r>
+            <w:r>
+              <w:rPr>
+                <w:rFonts w:cstheme="minorHAnsi"/>
+              </w:rPr>
+              <w:t>t</w:t>
+            </w:r>
+            <w:r>
+              <w:rPr>
+                <w:rFonts w:cstheme="minorHAnsi"/>
+              </w:rPr>
+              <w:t xml:space="preserve"> </w:t>
+            </w:r>
+            <w:r>
+              <w:rPr>
+                <w:rFonts w:cstheme="minorHAnsi"/>
+              </w:rPr>
+              <w:t>a</w:t>
+            </w:r>
+            <w:r>
+              <w:rPr>
+                <w:rFonts w:cstheme="minorHAnsi"/>
+              </w:rPr>
+              <w:t xml:space="preserve"> module to exchange data with accounting </w:t>
+            </w:r>
+            <w:r>
+              <w:rPr>
+                <w:rFonts w:cstheme="minorHAnsi"/>
+              </w:rPr>
+              <w:t xml:space="preserve">and other </w:t>
+            </w:r>
+            <w:r>
+              <w:rPr>
+                <w:rFonts w:cstheme="minorHAnsi"/>
+              </w:rPr>
+              <w:t>software</w:t>
+            </w:r>
+            <w:r>
+              <w:rPr>
+                <w:rFonts w:cstheme="minorHAnsi"/>
+              </w:rPr>
+              <w:t>, generate business reports</w:t>
+            </w:r>
+          </w:p>
+          <w:bookmarkEnd w:id="5"/>
           <w:p>
             <w:pPr>
               <w:pStyle w:val="ListParagraph"/>
               <w:numPr>
                 <w:ilvl w:val="0"/>
-                <w:numId w:val="6"/>
+                <w:numId w:val="10"/>
               </w:numPr>
-              <w:spacing w:after="120"/>
+              <w:spacing w:before="120" w:after="120"/>
+              <w:ind w:left="630" w:right="-180"/>
               <w:jc w:val="both"/>
               <w:rPr>
                 <w:rFonts w:cstheme="minorHAnsi"/>
               </w:rPr>
             </w:pPr>
-            <w:bookmarkStart w:id="9" w:name="_Hlk123934409"/>
-            <w:r>
-              <w:rPr>
-                <w:rFonts w:cstheme="minorHAnsi"/>
-              </w:rPr>
-              <w:t>Develop</w:t>
-            </w:r>
-            <w:r>
-              <w:rPr>
-                <w:rFonts w:cstheme="minorHAnsi"/>
-              </w:rPr>
-              <w:t xml:space="preserve"> a</w:t>
-            </w:r>
-            <w:r>
-              <w:rPr>
-                <w:rFonts w:cstheme="minorHAnsi"/>
-              </w:rPr>
-              <w:t xml:space="preserve"> website for </w:t>
-            </w:r>
-            <w:r>
-              <w:rPr>
-                <w:rFonts w:cstheme="minorHAnsi"/>
-              </w:rPr>
-              <w:t xml:space="preserve">a </w:t>
-            </w:r>
-            <w:r>
-              <w:rPr>
-                <w:rFonts w:cstheme="minorHAnsi"/>
-              </w:rPr>
-              <w:t xml:space="preserve">small family </w:t>
-            </w:r>
-            <w:r>
-              <w:rPr>
-                <w:rFonts w:cstheme="minorHAnsi"/>
-              </w:rPr>
-              <w:t>toy store</w:t>
-            </w:r>
-            <w:r>
-              <w:rPr>
-                <w:rFonts w:cstheme="minorHAnsi"/>
-              </w:rPr>
-              <w:t>.</w:t>
-            </w:r>
-          </w:p>
-          <w:p>
-            <w:pPr>
-              <w:pStyle w:val="ListParagraph"/>
-              <w:numPr>
-                <w:ilvl w:val="0"/>
-                <w:numId w:val="6"/>
-              </w:numPr>
-              <w:spacing w:after="120"/>
-              <w:jc w:val="both"/>
-              <w:rPr>
-                <w:rFonts w:cstheme="minorHAnsi"/>
-              </w:rPr>
-            </w:pPr>
-            <w:r>
-              <w:rPr>
-                <w:rFonts w:cstheme="minorHAnsi"/>
-              </w:rPr>
-              <w:t>Develop an accounting tool</w:t>
-            </w:r>
-            <w:r>
-              <w:rPr>
-                <w:rFonts w:cstheme="minorHAnsi"/>
-              </w:rPr>
-              <w:t>.</w:t>
-            </w:r>
-          </w:p>
-          <w:p>
-            <w:pPr>
-              <w:pStyle w:val="ListParagraph"/>
-              <w:numPr>
-                <w:ilvl w:val="0"/>
-                <w:numId w:val="6"/>
-              </w:numPr>
-              <w:spacing w:after="120"/>
-              <w:jc w:val="both"/>
-              <w:rPr>
-                <w:rFonts w:cstheme="minorHAnsi"/>
-              </w:rPr>
-            </w:pPr>
-            <w:r>
-              <w:rPr>
-                <w:rFonts w:cstheme="minorHAnsi"/>
-              </w:rPr>
-              <w:t>Toy market research</w:t>
-            </w:r>
-            <w:r>
-              <w:rPr>
-                <w:rFonts w:cstheme="minorHAnsi"/>
-              </w:rPr>
-              <w:t>.</w:t>
-            </w:r>
-          </w:p>
-          <w:p>
-            <w:pPr>
-              <w:pStyle w:val="ListParagraph"/>
-              <w:numPr>
-                <w:ilvl w:val="0"/>
-                <w:numId w:val="6"/>
-              </w:numPr>
-              <w:spacing w:after="120"/>
-              <w:jc w:val="both"/>
-              <w:rPr>
-                <w:rFonts w:cstheme="minorHAnsi"/>
-              </w:rPr>
-            </w:pPr>
-            <w:r>
-              <w:rPr>
-                <w:rFonts w:cstheme="minorHAnsi"/>
-              </w:rPr>
-              <w:t>Help to grow and sell the business</w:t>
-            </w:r>
-            <w:r>
-              <w:rPr>
-                <w:rFonts w:cstheme="minorHAnsi"/>
-              </w:rPr>
-              <w:t>.</w:t>
-            </w:r>
-            <w:bookmarkEnd w:id="9"/>
+            <w:r>
+              <w:rPr>
+                <w:rFonts w:cstheme="minorHAnsi"/>
+              </w:rPr>
+              <w:t>Work</w:t>
+            </w:r>
+            <w:r>
+              <w:rPr>
+                <w:rFonts w:cstheme="minorHAnsi"/>
+              </w:rPr>
+              <w:t>ed</w:t>
+            </w:r>
+            <w:r>
+              <w:rPr>
+                <w:rFonts w:cstheme="minorHAnsi"/>
+              </w:rPr>
+              <w:t xml:space="preserve"> with SEO and advertising agencies</w:t>
+            </w:r>
+            <w:bookmarkEnd w:id="4"/>
           </w:p>
         </w:tc>
         <w:tc>
           <w:tcPr>
-            <w:tcW w:w="4324" w:type="dxa"/>
+            <w:tcW w:w="3497" w:type="dxa"/>
             <w:tcBorders>
               <w:top w:val="nil"/>
               <w:left w:val="nil"/>
@@ -1415,6 +1302,7 @@
               <w:pBdr>
                 <w:bottom w:val="single" w:sz="4" w:space="1" w:color="auto"/>
               </w:pBdr>
+              <w:ind w:left="-180"/>
               <w:rPr>
                 <w:rFonts w:cstheme="minorHAnsi"/>
                 <w:b/>
@@ -1431,20 +1319,13 @@
                 <w:sz w:val="36"/>
                 <w:szCs w:val="36"/>
               </w:rPr>
-              <w:lastRenderedPageBreak/>
               <w:t>Contact</w:t>
             </w:r>
           </w:p>
           <w:p>
             <w:pPr>
-              <w:rPr>
-                <w:rFonts w:cstheme="minorHAnsi"/>
-              </w:rPr>
-            </w:pPr>
-          </w:p>
-          <w:p>
-            <w:pPr>
-              <w:spacing w:after="240"/>
+              <w:spacing w:before="120" w:after="120" w:line="276" w:lineRule="auto"/>
+              <w:ind w:left="-187"/>
               <w:rPr>
                 <w:rFonts w:cstheme="minorHAnsi"/>
                 <w:sz w:val="24"/>
@@ -1462,7 +1343,8 @@
           </w:p>
           <w:p>
             <w:pPr>
-              <w:spacing w:after="240"/>
+              <w:spacing w:before="120" w:after="120" w:line="276" w:lineRule="auto"/>
+              <w:ind w:left="-187"/>
               <w:rPr>
                 <w:rFonts w:cstheme="minorHAnsi"/>
                 <w:sz w:val="24"/>
@@ -1480,7 +1362,8 @@
           </w:p>
           <w:p>
             <w:pPr>
-              <w:spacing w:after="240"/>
+              <w:spacing w:before="120" w:after="120" w:line="276" w:lineRule="auto"/>
+              <w:ind w:left="-187"/>
               <w:rPr>
                 <w:rStyle w:val="Hyperlink"/>
                 <w:rFonts w:cstheme="minorHAnsi"/>
@@ -1504,7 +1387,8 @@
           </w:p>
           <w:p>
             <w:pPr>
-              <w:spacing w:after="240"/>
+              <w:spacing w:before="120" w:after="120" w:line="276" w:lineRule="auto"/>
+              <w:ind w:left="-187"/>
               <w:rPr>
                 <w:rFonts w:cstheme="minorHAnsi"/>
                 <w:sz w:val="24"/>
@@ -1526,6 +1410,8 @@
           </w:p>
           <w:p>
             <w:pPr>
+              <w:spacing w:before="120" w:after="120" w:line="276" w:lineRule="auto"/>
+              <w:ind w:left="-187"/>
               <w:rPr>
                 <w:rFonts w:cstheme="minorHAnsi"/>
                 <w:sz w:val="24"/>
@@ -1548,16 +1434,10 @@
           </w:p>
           <w:p>
             <w:pPr>
-              <w:rPr>
-                <w:rFonts w:cstheme="minorHAnsi"/>
-              </w:rPr>
-            </w:pPr>
-          </w:p>
-          <w:p>
-            <w:pPr>
               <w:pBdr>
                 <w:bottom w:val="single" w:sz="4" w:space="1" w:color="auto"/>
               </w:pBdr>
+              <w:ind w:left="-180"/>
               <w:rPr>
                 <w:rFonts w:cstheme="minorHAnsi"/>
                 <w:b/>
@@ -1580,22 +1460,107 @@
           <w:p>
             <w:pPr>
               <w:spacing w:after="240"/>
-              <w:rPr>
-                <w:rFonts w:cstheme="minorHAnsi"/>
-              </w:rPr>
-            </w:pPr>
-            <w:r>
-              <w:rPr>
-                <w:rFonts w:cstheme="minorHAnsi"/>
+              <w:ind w:left="-180"/>
+              <w:rPr>
+                <w:rFonts w:cstheme="minorHAnsi"/>
+              </w:rPr>
+            </w:pPr>
+            <w:r>
+              <w:rPr>
+                <w:rFonts w:cstheme="minorHAnsi"/>
+                <w:color w:val="808080" w:themeColor="background1" w:themeShade="80"/>
+              </w:rPr>
+              <w:t>Back-End</w:t>
+            </w:r>
+            <w:r>
+              <w:rPr>
+                <w:rFonts w:cstheme="minorHAnsi"/>
+                <w:color w:val="808080" w:themeColor="background1" w:themeShade="80"/>
+              </w:rPr>
+              <w:t>:</w:t>
+            </w:r>
+            <w:r>
+              <w:rPr>
+                <w:rFonts w:cstheme="minorHAnsi"/>
+                <w:color w:val="808080" w:themeColor="background1" w:themeShade="80"/>
               </w:rPr>
               <w:br/>
             </w:r>
             <w:r>
               <w:rPr>
                 <w:rFonts w:cstheme="minorHAnsi"/>
+              </w:rPr>
+              <w:t>PHP</w:t>
+            </w:r>
+            <w:r>
+              <w:rPr>
+                <w:rFonts w:cstheme="minorHAnsi"/>
+              </w:rPr>
+              <w:t xml:space="preserve"> 7,8</w:t>
+            </w:r>
+            <w:r>
+              <w:rPr>
+                <w:rFonts w:cstheme="minorHAnsi"/>
+              </w:rPr>
+              <w:t xml:space="preserve">, </w:t>
+            </w:r>
+            <w:r>
+              <w:rPr>
+                <w:rFonts w:cstheme="minorHAnsi"/>
+              </w:rPr>
+              <w:t>Laravel</w:t>
+            </w:r>
+            <w:r>
+              <w:rPr>
+                <w:rFonts w:cstheme="minorHAnsi"/>
+              </w:rPr>
+              <w:t xml:space="preserve"> 7-1</w:t>
+            </w:r>
+            <w:r>
+              <w:rPr>
+                <w:rFonts w:cstheme="minorHAnsi"/>
+              </w:rPr>
+              <w:t>3</w:t>
+            </w:r>
+            <w:r>
+              <w:rPr>
+                <w:rFonts w:cstheme="minorHAnsi"/>
+              </w:rPr>
+              <w:t>,</w:t>
+            </w:r>
+            <w:r>
+              <w:rPr>
+                <w:rFonts w:cstheme="minorHAnsi"/>
+              </w:rPr>
+              <w:t xml:space="preserve"> </w:t>
+            </w:r>
+            <w:r>
+              <w:rPr>
+                <w:rFonts w:cstheme="minorHAnsi"/>
+              </w:rPr>
+              <w:t>MySQL,</w:t>
+            </w:r>
+            <w:r>
+              <w:rPr>
+                <w:rFonts w:cstheme="minorHAnsi"/>
+              </w:rPr>
+              <w:t xml:space="preserve"> </w:t>
+            </w:r>
+          </w:p>
+          <w:p>
+            <w:pPr>
+              <w:spacing w:after="240"/>
+              <w:ind w:left="-180"/>
+              <w:rPr>
+                <w:rFonts w:cstheme="minorHAnsi"/>
+              </w:rPr>
+            </w:pPr>
+            <w:r>
+              <w:rPr>
+                <w:rFonts w:cstheme="minorHAnsi"/>
                 <w:color w:val="808080" w:themeColor="background1" w:themeShade="80"/>
               </w:rPr>
-              <w:t>Back-End</w:t>
+              <w:t>Front-End</w:t>
             </w:r>
             <w:r>
               <w:rPr>
@@ -1615,25 +1580,117 @@
               <w:rPr>
                 <w:rFonts w:cstheme="minorHAnsi"/>
               </w:rPr>
-              <w:t xml:space="preserve">PHP, </w:t>
-            </w:r>
-            <w:r>
-              <w:rPr>
-                <w:rFonts w:cstheme="minorHAnsi"/>
-              </w:rPr>
-              <w:t>Laravel,</w:t>
-            </w:r>
-            <w:r>
-              <w:rPr>
-                <w:rFonts w:cstheme="minorHAnsi"/>
-              </w:rPr>
+              <w:t xml:space="preserve">HTML, CSS, </w:t>
+            </w:r>
+            <w:r>
+              <w:rPr>
+                <w:rFonts w:cstheme="minorHAnsi"/>
+              </w:rPr>
+              <w:t>JavaScript</w:t>
+            </w:r>
+            <w:r>
+              <w:rPr>
+                <w:rFonts w:cstheme="minorHAnsi"/>
+              </w:rPr>
+              <w:t xml:space="preserve">, </w:t>
+            </w:r>
+            <w:r>
+              <w:t>Bootstrap</w:t>
+            </w:r>
+            <w:r>
               <w:t xml:space="preserve"> </w:t>
             </w:r>
             <w:r>
-              <w:rPr>
-                <w:rFonts w:cstheme="minorHAnsi"/>
-              </w:rPr>
-              <w:t>MySQL,</w:t>
+              <w:t>4</w:t>
+            </w:r>
+            <w:r>
+              <w:rPr>
+                <w:rFonts w:cstheme="minorHAnsi"/>
+              </w:rPr>
+              <w:t>,5</w:t>
+            </w:r>
+            <w:r>
+              <w:rPr>
+                <w:rFonts w:cstheme="minorHAnsi"/>
+              </w:rPr>
+              <w:t>, jQuery</w:t>
+            </w:r>
+            <w:r>
+              <w:rPr>
+                <w:rFonts w:cstheme="minorHAnsi"/>
+              </w:rPr>
+              <w:t>, Vue</w:t>
+            </w:r>
+            <w:r>
+              <w:rPr>
+                <w:rFonts w:cstheme="minorHAnsi"/>
+              </w:rPr>
+              <w:t xml:space="preserve"> 2,3</w:t>
+            </w:r>
+          </w:p>
+          <w:p>
+            <w:pPr>
+              <w:spacing w:after="240"/>
+              <w:ind w:left="-180"/>
+              <w:rPr>
+                <w:rFonts w:cstheme="minorHAnsi"/>
+              </w:rPr>
+            </w:pPr>
+            <w:r>
+              <w:rPr>
+                <w:rFonts w:cstheme="minorHAnsi"/>
+                <w:color w:val="808080" w:themeColor="background1" w:themeShade="80"/>
+              </w:rPr>
+              <w:t>AI &amp; Automation</w:t>
+            </w:r>
+            <w:r>
+              <w:rPr>
+                <w:rFonts w:cstheme="minorHAnsi"/>
+                <w:color w:val="808080" w:themeColor="background1" w:themeShade="80"/>
+              </w:rPr>
+              <w:t>:</w:t>
+            </w:r>
+            <w:r>
+              <w:rPr>
+                <w:rFonts w:cstheme="minorHAnsi"/>
+                <w:color w:val="808080" w:themeColor="background1" w:themeShade="80"/>
+              </w:rPr>
+              <w:br/>
+            </w:r>
+            <w:r>
+              <w:rPr>
+                <w:rFonts w:cstheme="minorHAnsi"/>
+              </w:rPr>
+              <w:t>OpenAI, Anthropic, Claude Code, Codex, AI chatbots, vector search, embeddings</w:t>
+            </w:r>
+          </w:p>
+          <w:p>
+            <w:pPr>
+              <w:spacing w:after="240"/>
+              <w:ind w:left="-180"/>
+              <w:rPr>
+                <w:rFonts w:cstheme="minorHAnsi"/>
+              </w:rPr>
+            </w:pPr>
+            <w:r>
+              <w:rPr>
+                <w:rFonts w:cstheme="minorHAnsi"/>
+                <w:color w:val="808080" w:themeColor="background1" w:themeShade="80"/>
+              </w:rPr>
+              <w:t>Additional:</w:t>
+            </w:r>
+            <w:r>
+              <w:rPr>
+                <w:rFonts w:cstheme="minorHAnsi"/>
+                <w:color w:val="808080" w:themeColor="background1" w:themeShade="80"/>
+              </w:rPr>
+              <w:br/>
+            </w:r>
+            <w:r>
+              <w:rPr>
+                <w:rFonts w:cstheme="minorHAnsi"/>
+              </w:rPr>
+              <w:t>SEO, MVC, JSON, XML, API, Git,</w:t>
             </w:r>
             <w:r>
               <w:rPr>
@@ -1645,12 +1702,25 @@
               <w:rPr>
                 <w:rFonts w:cstheme="minorHAnsi"/>
               </w:rPr>
-              <w:t>Python, Flask</w:t>
+              <w:t>Gitlab, Jira, Slack</w:t>
+            </w:r>
+            <w:r>
+              <w:rPr>
+                <w:rFonts w:cstheme="minorHAnsi"/>
+              </w:rPr>
+              <w:t>,</w:t>
+            </w:r>
+            <w:r>
+              <w:rPr>
+                <w:rFonts w:cstheme="minorHAnsi"/>
+              </w:rPr>
+              <w:t xml:space="preserve"> LAMP</w:t>
             </w:r>
           </w:p>
           <w:p>
             <w:pPr>
               <w:spacing w:after="240"/>
+              <w:ind w:left="-180"/>
               <w:rPr>
                 <w:rFonts w:cstheme="minorHAnsi"/>
               </w:rPr>
@@ -1660,132 +1730,38 @@
                 <w:rFonts w:cstheme="minorHAnsi"/>
                 <w:color w:val="808080" w:themeColor="background1" w:themeShade="80"/>
               </w:rPr>
-              <w:t>Front-End</w:t>
+              <w:t>Deployment:</w:t>
             </w:r>
             <w:r>
               <w:rPr>
                 <w:rFonts w:cstheme="minorHAnsi"/>
                 <w:color w:val="808080" w:themeColor="background1" w:themeShade="80"/>
               </w:rPr>
-              <w:t>:</w:t>
-            </w:r>
-            <w:r>
-              <w:rPr>
-                <w:rFonts w:cstheme="minorHAnsi"/>
-                <w:color w:val="808080" w:themeColor="background1" w:themeShade="80"/>
-              </w:rPr>
               <w:br/>
             </w:r>
             <w:r>
               <w:rPr>
                 <w:rFonts w:cstheme="minorHAnsi"/>
               </w:rPr>
-              <w:t xml:space="preserve">HTML, CSS, </w:t>
-            </w:r>
-            <w:r>
-              <w:rPr>
-                <w:rFonts w:cstheme="minorHAnsi"/>
-              </w:rPr>
-              <w:t>JavaScript</w:t>
-            </w:r>
-            <w:r>
-              <w:rPr>
-                <w:rFonts w:cstheme="minorHAnsi"/>
-              </w:rPr>
-              <w:t>, Bootstrap, jQuery</w:t>
-            </w:r>
-            <w:r>
-              <w:rPr>
-                <w:rFonts w:cstheme="minorHAnsi"/>
-              </w:rPr>
-              <w:t>, Vue</w:t>
-            </w:r>
-          </w:p>
-          <w:p>
-            <w:pPr>
-              <w:spacing w:after="240"/>
-              <w:rPr>
-                <w:rFonts w:cstheme="minorHAnsi"/>
-              </w:rPr>
-            </w:pPr>
-            <w:r>
-              <w:rPr>
-                <w:rFonts w:cstheme="minorHAnsi"/>
-                <w:color w:val="808080" w:themeColor="background1" w:themeShade="80"/>
-              </w:rPr>
-              <w:t>Additional</w:t>
-            </w:r>
-            <w:r>
-              <w:rPr>
-                <w:rFonts w:cstheme="minorHAnsi"/>
-                <w:color w:val="808080" w:themeColor="background1" w:themeShade="80"/>
-              </w:rPr>
-              <w:t>:</w:t>
-            </w:r>
-            <w:r>
-              <w:rPr>
-                <w:rFonts w:cstheme="minorHAnsi"/>
-                <w:color w:val="808080" w:themeColor="background1" w:themeShade="80"/>
-              </w:rPr>
-              <w:br/>
-            </w:r>
-            <w:r>
-              <w:rPr>
-                <w:rFonts w:cstheme="minorHAnsi"/>
-              </w:rPr>
-              <w:t>SEO, MVC, JSON,</w:t>
-            </w:r>
-            <w:r>
-              <w:rPr>
-                <w:rFonts w:cstheme="minorHAnsi"/>
-              </w:rPr>
-              <w:t xml:space="preserve"> XML,</w:t>
-            </w:r>
-            <w:r>
-              <w:rPr>
-                <w:rFonts w:cstheme="minorHAnsi"/>
-              </w:rPr>
-              <w:t xml:space="preserve"> API, Git</w:t>
-            </w:r>
-            <w:r>
-              <w:rPr>
-                <w:rFonts w:cstheme="minorHAnsi"/>
-              </w:rPr>
-              <w:t>, LAMP</w:t>
-            </w:r>
-          </w:p>
-          <w:p>
-            <w:pPr>
-              <w:spacing w:after="240"/>
-              <w:rPr>
-                <w:rFonts w:cstheme="minorHAnsi"/>
-              </w:rPr>
-            </w:pPr>
-            <w:r>
-              <w:rPr>
-                <w:rFonts w:cstheme="minorHAnsi"/>
-                <w:color w:val="808080" w:themeColor="background1" w:themeShade="80"/>
-              </w:rPr>
-              <w:t>Deployment:</w:t>
-            </w:r>
-            <w:r>
-              <w:rPr>
-                <w:rFonts w:cstheme="minorHAnsi"/>
-                <w:color w:val="808080" w:themeColor="background1" w:themeShade="80"/>
-              </w:rPr>
-              <w:br/>
-            </w:r>
-            <w:r>
-              <w:rPr>
-                <w:rFonts w:cstheme="minorHAnsi"/>
-              </w:rPr>
               <w:t>Digital Ocean, Linode, Ubuntu</w:t>
             </w:r>
             <w:r>
               <w:rPr>
                 <w:rFonts w:cstheme="minorHAnsi"/>
               </w:rPr>
-              <w:t>, Apache</w:t>
+              <w:t xml:space="preserve">, </w:t>
+            </w:r>
+            <w:r>
+              <w:rPr>
+                <w:rFonts w:cstheme="minorHAnsi"/>
+              </w:rPr>
+              <w:t xml:space="preserve">Debian, </w:t>
+            </w:r>
+            <w:r>
+              <w:rPr>
+                <w:rFonts w:cstheme="minorHAnsi"/>
+              </w:rPr>
+              <w:t>Apache</w:t>
             </w:r>
             <w:r>
               <w:rPr>
@@ -1799,6 +1775,7 @@
               <w:pBdr>
                 <w:bottom w:val="single" w:sz="4" w:space="1" w:color="auto"/>
               </w:pBdr>
+              <w:ind w:left="-180"/>
               <w:rPr>
                 <w:rFonts w:cstheme="minorHAnsi"/>
                 <w:b/>
@@ -1820,127 +1797,55 @@
           </w:p>
           <w:p>
             <w:pPr>
-              <w:rPr>
-                <w:rFonts w:cstheme="minorHAnsi"/>
-              </w:rPr>
-            </w:pPr>
-            <w:r>
-              <w:rPr>
-                <w:rFonts w:cstheme="minorHAnsi"/>
-              </w:rPr>
-              <w:br/>
-            </w:r>
+              <w:spacing w:before="120" w:after="120" w:line="276" w:lineRule="auto"/>
+              <w:ind w:left="-187"/>
+              <w:rPr>
+                <w:rFonts w:cstheme="minorHAnsi"/>
+              </w:rPr>
+            </w:pPr>
             <w:r>
               <w:rPr>
                 <w:rFonts w:cstheme="minorHAnsi"/>
                 <w:sz w:val="24"/>
                 <w:szCs w:val="24"/>
               </w:rPr>
-              <w:t xml:space="preserve">English </w:t>
-            </w:r>
-          </w:p>
-          <w:tbl>
-            <w:tblPr>
-              <w:tblStyle w:val="TableGrid"/>
-              <w:tblW w:w="0" w:type="auto"/>
-              <w:tblLook w:val="04A0" w:firstRow="1" w:lastRow="0" w:firstColumn="1" w:lastColumn="0" w:noHBand="0" w:noVBand="1"/>
-            </w:tblPr>
-            <w:tblGrid>
-              <w:gridCol w:w="2424"/>
-              <w:gridCol w:w="717"/>
-            </w:tblGrid>
-            <w:tr>
-              <w:trPr>
-                <w:trHeight w:val="275"/>
-              </w:trPr>
-              <w:tc>
-                <w:tcPr>
-                  <w:tcW w:w="2424" w:type="dxa"/>
-                  <w:shd w:val="clear" w:color="auto" w:fill="A8D08D" w:themeFill="accent6" w:themeFillTint="99"/>
-                </w:tcPr>
-                <w:p>
-                  <w:pPr>
-                    <w:jc w:val="center"/>
-                    <w:rPr>
-                      <w:rFonts w:cstheme="minorHAnsi"/>
-                    </w:rPr>
-                  </w:pPr>
-                </w:p>
-              </w:tc>
-              <w:tc>
-                <w:tcPr>
-                  <w:tcW w:w="717" w:type="dxa"/>
-                </w:tcPr>
-                <w:p>
-                  <w:pPr>
-                    <w:rPr>
-                      <w:rFonts w:cstheme="minorHAnsi"/>
-                    </w:rPr>
-                  </w:pPr>
-                </w:p>
-              </w:tc>
-            </w:tr>
-          </w:tbl>
-          <w:p>
-            <w:pPr>
-              <w:rPr>
-                <w:rFonts w:cstheme="minorHAnsi"/>
-              </w:rPr>
-            </w:pPr>
-          </w:p>
-          <w:p>
-            <w:pPr>
-              <w:rPr>
-                <w:rFonts w:cstheme="minorHAnsi"/>
-              </w:rPr>
-            </w:pPr>
+              <w:t>English</w:t>
+            </w:r>
+            <w:r>
+              <w:rPr>
+                <w:rFonts w:cstheme="minorHAnsi"/>
+                <w:sz w:val="24"/>
+                <w:szCs w:val="24"/>
+              </w:rPr>
+              <w:t>: Fluent</w:t>
+            </w:r>
+            <w:r>
+              <w:rPr>
+                <w:rFonts w:cstheme="minorHAnsi"/>
+                <w:sz w:val="24"/>
+                <w:szCs w:val="24"/>
+              </w:rPr>
+              <w:br/>
+            </w:r>
             <w:r>
               <w:rPr>
                 <w:rFonts w:cstheme="minorHAnsi"/>
               </w:rPr>
               <w:t>Russian</w:t>
             </w:r>
-          </w:p>
-          <w:tbl>
-            <w:tblPr>
-              <w:tblStyle w:val="TableGrid"/>
-              <w:tblW w:w="0" w:type="auto"/>
-              <w:tblLook w:val="04A0" w:firstRow="1" w:lastRow="0" w:firstColumn="1" w:lastColumn="0" w:noHBand="0" w:noVBand="1"/>
-            </w:tblPr>
-            <w:tblGrid>
-              <w:gridCol w:w="3142"/>
-            </w:tblGrid>
-            <w:tr>
-              <w:trPr>
-                <w:trHeight w:val="275"/>
-              </w:trPr>
-              <w:tc>
-                <w:tcPr>
-                  <w:tcW w:w="3142" w:type="dxa"/>
-                  <w:shd w:val="clear" w:color="auto" w:fill="A8D08D" w:themeFill="accent6" w:themeFillTint="99"/>
-                </w:tcPr>
-                <w:p>
-                  <w:pPr>
-                    <w:rPr>
-                      <w:rFonts w:cstheme="minorHAnsi"/>
-                    </w:rPr>
-                  </w:pPr>
-                </w:p>
-              </w:tc>
-            </w:tr>
-          </w:tbl>
-          <w:p>
-            <w:pPr>
-              <w:rPr>
-                <w:rFonts w:cstheme="minorHAnsi"/>
-              </w:rPr>
-            </w:pPr>
+            <w:r>
+              <w:rPr>
+                <w:rFonts w:cstheme="minorHAnsi"/>
+              </w:rPr>
+              <w:t>: Native</w:t>
+            </w:r>
           </w:p>
           <w:p>
             <w:pPr>
               <w:pBdr>
                 <w:bottom w:val="single" w:sz="4" w:space="1" w:color="auto"/>
               </w:pBdr>
+              <w:ind w:left="-180"/>
               <w:rPr>
                 <w:rFonts w:cstheme="minorHAnsi"/>
                 <w:b/>
@@ -1949,7 +1854,7 @@
                 <w:szCs w:val="36"/>
               </w:rPr>
             </w:pPr>
-            <w:bookmarkStart w:id="10" w:name="_Hlk141829642"/>
+            <w:bookmarkStart w:id="6" w:name="_Hlk141829642"/>
             <w:r>
               <w:rPr>
                 <w:rFonts w:cstheme="minorHAnsi"/>
@@ -1961,17 +1866,11 @@
               <w:t>Interests</w:t>
             </w:r>
           </w:p>
-          <w:bookmarkEnd w:id="10"/>
-          <w:p>
-            <w:pPr>
-              <w:rPr>
-                <w:rFonts w:cstheme="minorHAnsi"/>
-              </w:rPr>
-            </w:pPr>
-          </w:p>
-          <w:p>
-            <w:pPr>
-              <w:spacing w:line="360" w:lineRule="auto"/>
+          <w:bookmarkEnd w:id="6"/>
+          <w:p>
+            <w:pPr>
+              <w:spacing w:before="120" w:after="120" w:line="360" w:lineRule="auto"/>
+              <w:ind w:left="-187"/>
               <w:rPr>
                 <w:rFonts w:cstheme="minorHAnsi"/>
               </w:rPr>
@@ -1986,25 +1885,19 @@
               <w:rPr>
                 <w:rFonts w:cstheme="minorHAnsi"/>
               </w:rPr>
-              <w:t xml:space="preserve"> </w:t>
-            </w:r>
-            <w:r>
-              <w:rPr>
-                <w:rFonts w:cstheme="minorHAnsi"/>
-              </w:rPr>
-              <w:t xml:space="preserve">| </w:t>
-            </w:r>
-            <w:r>
-              <w:rPr>
-                <w:rFonts w:cstheme="minorHAnsi"/>
-              </w:rPr>
-              <w:t xml:space="preserve">Woodworking </w:t>
-            </w:r>
-            <w:r>
-              <w:rPr>
-                <w:rFonts w:cstheme="minorHAnsi"/>
-              </w:rPr>
-              <w:t xml:space="preserve">| </w:t>
+              <w:t xml:space="preserve">, </w:t>
+            </w:r>
+            <w:r>
+              <w:rPr>
+                <w:rFonts w:cstheme="minorHAnsi"/>
+              </w:rPr>
+              <w:t>Woodworking</w:t>
+            </w:r>
+            <w:r>
+              <w:rPr>
+                <w:rFonts w:cstheme="minorHAnsi"/>
+              </w:rPr>
+              <w:t xml:space="preserve">, </w:t>
             </w:r>
             <w:r>
               <w:rPr>
@@ -2018,6 +1911,7 @@
               <w:pBdr>
                 <w:bottom w:val="single" w:sz="4" w:space="1" w:color="auto"/>
               </w:pBdr>
+              <w:ind w:left="-180"/>
               <w:rPr>
                 <w:rFonts w:cstheme="minorHAnsi"/>
                 <w:b/>
@@ -2039,13 +1933,8 @@
           </w:p>
           <w:p>
             <w:pPr>
-              <w:rPr>
-                <w:rFonts w:cstheme="minorHAnsi"/>
-              </w:rPr>
-            </w:pPr>
-          </w:p>
-          <w:p>
-            <w:pPr>
+              <w:spacing w:before="120" w:after="120"/>
+              <w:ind w:left="-187"/>
               <w:rPr>
                 <w:rFonts w:cstheme="minorHAnsi"/>
               </w:rPr>
@@ -2056,13 +1945,12 @@
               </w:rPr>
               <w:t>1996 – 2001 Moscow, Russia</w:t>
             </w:r>
-          </w:p>
-          <w:p>
-            <w:pPr>
-              <w:rPr>
-                <w:rFonts w:cstheme="minorHAnsi"/>
-              </w:rPr>
-            </w:pPr>
+            <w:r>
+              <w:rPr>
+                <w:rFonts w:cstheme="minorHAnsi"/>
+              </w:rPr>
+              <w:br/>
+            </w:r>
             <w:r>
               <w:rPr>
                 <w:rFonts w:cstheme="minorHAnsi"/>
@@ -2072,6 +1960,8 @@
           </w:p>
           <w:p>
             <w:pPr>
+              <w:spacing w:before="120" w:after="120"/>
+              <w:ind w:left="-187"/>
               <w:rPr>
                 <w:rFonts w:cstheme="minorHAnsi"/>
               </w:rPr>
@@ -2106,7 +1996,7 @@
 </file>
 
 <file path=word/numbering.xml><?xml version="1.0" encoding="utf-8"?>
-<w:numbering xmlns:wpc="http://schemas.microsoft.com/office/word/2010/wordprocessingCanvas" xmlns:cx="http://schemas.microsoft.com/office/drawing/2014/chartex" xmlns:cx1="http://schemas.microsoft.com/office/drawing/2015/9/8/chartex" xmlns:cx2="http://schemas.microsoft.com/office/drawing/2015/10/21/chartex" xmlns:cx3="http://schemas.microsoft.com/office/drawing/2016/5/9/chartex" xmlns:cx4="http://schemas.microsoft.com/office/drawing/2016/5/10/chartex" xmlns:cx5="http://schemas.microsoft.com/office/drawing/2016/5/11/chartex" xmlns:cx6="http://schemas.microsoft.com/office/drawing/2016/5/12/chartex" xmlns:cx7="http://schemas.microsoft.com/office/drawing/2016/5/13/chartex" xmlns:cx8="http://schemas.microsoft.com/office/drawing/2016/5/14/chartex" xmlns:mc="http://schemas.openxmlformats.org/markup-compatibility/2006" xmlns:aink="http://schemas.microsoft.com/office/drawing/2016/ink" xmlns:am3d="http://schemas.microsoft.com/office/drawing/2017/model3d" xmlns:o="urn:schemas-microsoft-com:office:office" xmlns:oel="http://schemas.microsoft.com/office/2019/extlst" xmlns:r="http://schemas.openxmlformats.org/officeDocument/2006/relationships" xmlns:m="http://schemas.openxmlformats.org/officeDocument/2006/math" xmlns:v="urn:schemas-microsoft-com:vml" xmlns:wp14="http://schemas.microsoft.com/office/word/2010/wordprocessingDrawing" xmlns:wp="http://schemas.openxmlformats.org/drawingml/2006/wordprocessingDrawing" xmlns:w10="urn:schemas-microsoft-com:office:word" xmlns:w="http://schemas.openxmlformats.org/wordprocessingml/2006/main" xmlns:w14="http://schemas.microsoft.com/office/word/2010/wordml" xmlns:w15="http://schemas.microsoft.com/office/word/2012/wordml" xmlns:w16cex="http://schemas.microsoft.com/office/word/2018/wordml/cex" xmlns:w16cid="http://schemas.microsoft.com/office/word/2016/wordml/cid" xmlns:w16="http://schemas.microsoft.com/office/word/2018/wordml" xmlns:w16sdtdh="http://schemas.microsoft.com/office/word/2020/wordml/sdtdatahash" xmlns:w16se="http://schemas.microsoft.com/office/word/2015/wordml/symex" xmlns:wpg="http://schemas.microsoft.com/office/word/2010/wordprocessingGroup" xmlns:wpi="http://schemas.microsoft.com/office/word/2010/wordprocessingInk" xmlns:wne="http://schemas.microsoft.com/office/word/2006/wordml" xmlns:wps="http://schemas.microsoft.com/office/word/2010/wordprocessingShape" mc:Ignorable="w14 w15 w16se w16cid w16 w16cex w16sdtdh wp14">
+<w:numbering xmlns:wpc="http://schemas.microsoft.com/office/word/2010/wordprocessingCanvas" xmlns:cx="http://schemas.microsoft.com/office/drawing/2014/chartex" xmlns:cx1="http://schemas.microsoft.com/office/drawing/2015/9/8/chartex" xmlns:cx2="http://schemas.microsoft.com/office/drawing/2015/10/21/chartex" xmlns:cx3="http://schemas.microsoft.com/office/drawing/2016/5/9/chartex" xmlns:cx4="http://schemas.microsoft.com/office/drawing/2016/5/10/chartex" xmlns:cx5="http://schemas.microsoft.com/office/drawing/2016/5/11/chartex" xmlns:cx6="http://schemas.microsoft.com/office/drawing/2016/5/12/chartex" xmlns:cx7="http://schemas.microsoft.com/office/drawing/2016/5/13/chartex" xmlns:cx8="http://schemas.microsoft.com/office/drawing/2016/5/14/chartex" xmlns:mc="http://schemas.openxmlformats.org/markup-compatibility/2006" xmlns:aink="http://schemas.microsoft.com/office/drawing/2016/ink" xmlns:am3d="http://schemas.microsoft.com/office/drawing/2017/model3d" xmlns:o="urn:schemas-microsoft-com:office:office" xmlns:oel="http://schemas.microsoft.com/office/2019/extlst" xmlns:r="http://schemas.openxmlformats.org/officeDocument/2006/relationships" xmlns:m="http://schemas.openxmlformats.org/officeDocument/2006/math" xmlns:v="urn:schemas-microsoft-com:vml" xmlns:wp14="http://schemas.microsoft.com/office/word/2010/wordprocessingDrawing" xmlns:wp="http://schemas.openxmlformats.org/drawingml/2006/wordprocessingDrawing" xmlns:w10="urn:schemas-microsoft-com:office:word" xmlns:w="http://schemas.openxmlformats.org/wordprocessingml/2006/main" xmlns:w14="http://schemas.microsoft.com/office/word/2010/wordml" xmlns:w15="http://schemas.microsoft.com/office/word/2012/wordml" xmlns:w16cex="http://schemas.microsoft.com/office/word/2018/wordml/cex" xmlns:w16cid="http://schemas.microsoft.com/office/word/2016/wordml/cid" xmlns:w16="http://schemas.microsoft.com/office/word/2018/wordml" xmlns:w16du="http://schemas.microsoft.com/office/word/2023/wordml/word16du" xmlns:w16sdtdh="http://schemas.microsoft.com/office/word/2020/wordml/sdtdatahash" xmlns:w16sdtfl="http://schemas.microsoft.com/office/word/2024/wordml/sdtformatlock" xmlns:w16se="http://schemas.microsoft.com/office/word/2015/wordml/symex" xmlns:wpg="http://schemas.microsoft.com/office/word/2010/wordprocessingGroup" xmlns:wpi="http://schemas.microsoft.com/office/word/2010/wordprocessingInk" xmlns:wne="http://schemas.microsoft.com/office/word/2006/wordml" xmlns:wps="http://schemas.microsoft.com/office/word/2010/wordprocessingShape" mc:Ignorable="w14 w15 w16se w16cid w16 w16cex w16sdtdh w16sdtfl w16du wp14">
   <w:abstractNum w:abstractNumId="0" w15:restartNumberingAfterBreak="0">
     <w:nsid w:val="08B417B6"/>
     <w:multiLevelType w:val="multilevel"/>
@@ -2519,6 +2409,232 @@
     </w:lvl>
   </w:abstractNum>
   <w:abstractNum w:abstractNumId="3" w15:restartNumberingAfterBreak="0">
+    <w:nsid w:val="1BDF64CE"/>
+    <w:multiLevelType w:val="hybridMultilevel"/>
+    <w:tmpl w:val="BB74BF7C"/>
+    <w:lvl w:ilvl="0" w:tplc="FFFFFFFF">
+      <w:start w:val="1"/>
+      <w:numFmt w:val="bullet"/>
+      <w:lvlText w:val=""/>
+      <w:lvlJc w:val="left"/>
+      <w:pPr>
+        <w:ind w:left="720" w:hanging="360"/>
+      </w:pPr>
+      <w:rPr>
+        <w:rFonts w:ascii="Symbol" w:hAnsi="Symbol" w:hint="default"/>
+      </w:rPr>
+    </w:lvl>
+    <w:lvl w:ilvl="1" w:tplc="E1CCFA4C">
+      <w:start w:val="1"/>
+      <w:numFmt w:val="bullet"/>
+      <w:lvlText w:val="­"/>
+      <w:lvlJc w:val="left"/>
+      <w:pPr>
+        <w:ind w:left="1440" w:hanging="360"/>
+      </w:pPr>
+      <w:rPr>
+        <w:rFonts w:ascii="Courier New" w:hAnsi="Courier New" w:hint="default"/>
+      </w:rPr>
+    </w:lvl>
+    <w:lvl w:ilvl="2" w:tplc="FFFFFFFF" w:tentative="1">
+      <w:start w:val="1"/>
+      <w:numFmt w:val="bullet"/>
+      <w:lvlText w:val=""/>
+      <w:lvlJc w:val="left"/>
+      <w:pPr>
+        <w:ind w:left="2160" w:hanging="360"/>
+      </w:pPr>
+      <w:rPr>
+        <w:rFonts w:ascii="Wingdings" w:hAnsi="Wingdings" w:hint="default"/>
+      </w:rPr>
+    </w:lvl>
+    <w:lvl w:ilvl="3" w:tplc="FFFFFFFF" w:tentative="1">
+      <w:start w:val="1"/>
+      <w:numFmt w:val="bullet"/>
+      <w:lvlText w:val=""/>
+      <w:lvlJc w:val="left"/>
+      <w:pPr>
+        <w:ind w:left="2880" w:hanging="360"/>
+      </w:pPr>
+      <w:rPr>
+        <w:rFonts w:ascii="Symbol" w:hAnsi="Symbol" w:hint="default"/>
+      </w:rPr>
+    </w:lvl>
+    <w:lvl w:ilvl="4" w:tplc="FFFFFFFF" w:tentative="1">
+      <w:start w:val="1"/>
+      <w:numFmt w:val="bullet"/>
+      <w:lvlText w:val="o"/>
+      <w:lvlJc w:val="left"/>
+      <w:pPr>
+        <w:ind w:left="3600" w:hanging="360"/>
+      </w:pPr>
+      <w:rPr>
+        <w:rFonts w:ascii="Courier New" w:hAnsi="Courier New" w:cs="Courier New" w:hint="default"/>
+      </w:rPr>
+    </w:lvl>
+    <w:lvl w:ilvl="5" w:tplc="FFFFFFFF" w:tentative="1">
+      <w:start w:val="1"/>
+      <w:numFmt w:val="bullet"/>
+      <w:lvlText w:val=""/>
+      <w:lvlJc w:val="left"/>
+      <w:pPr>
+        <w:ind w:left="4320" w:hanging="360"/>
+      </w:pPr>
+      <w:rPr>
+        <w:rFonts w:ascii="Wingdings" w:hAnsi="Wingdings" w:hint="default"/>
+      </w:rPr>
+    </w:lvl>
+    <w:lvl w:ilvl="6" w:tplc="FFFFFFFF" w:tentative="1">
+      <w:start w:val="1"/>
+      <w:numFmt w:val="bullet"/>
+      <w:lvlText w:val=""/>
+      <w:lvlJc w:val="left"/>
+      <w:pPr>
+        <w:ind w:left="5040" w:hanging="360"/>
+      </w:pPr>
+      <w:rPr>
+        <w:rFonts w:ascii="Symbol" w:hAnsi="Symbol" w:hint="default"/>
+      </w:rPr>
+    </w:lvl>
+    <w:lvl w:ilvl="7" w:tplc="FFFFFFFF" w:tentative="1">
+      <w:start w:val="1"/>
+      <w:numFmt w:val="bullet"/>
+      <w:lvlText w:val="o"/>
+      <w:lvlJc w:val="left"/>
+      <w:pPr>
+        <w:ind w:left="5760" w:hanging="360"/>
+      </w:pPr>
+      <w:rPr>
+        <w:rFonts w:ascii="Courier New" w:hAnsi="Courier New" w:cs="Courier New" w:hint="default"/>
+      </w:rPr>
+    </w:lvl>
+    <w:lvl w:ilvl="8" w:tplc="FFFFFFFF" w:tentative="1">
+      <w:start w:val="1"/>
+      <w:numFmt w:val="bullet"/>
+      <w:lvlText w:val=""/>
+      <w:lvlJc w:val="left"/>
+      <w:pPr>
+        <w:ind w:left="6480" w:hanging="360"/>
+      </w:pPr>
+      <w:rPr>
+        <w:rFonts w:ascii="Wingdings" w:hAnsi="Wingdings" w:hint="default"/>
+      </w:rPr>
+    </w:lvl>
+  </w:abstractNum>
+  <w:abstractNum w:abstractNumId="4" w15:restartNumberingAfterBreak="0">
+    <w:nsid w:val="1C866BCE"/>
+    <w:multiLevelType w:val="hybridMultilevel"/>
+    <w:tmpl w:val="2B92DD3C"/>
+    <w:lvl w:ilvl="0" w:tplc="04090005">
+      <w:start w:val="1"/>
+      <w:numFmt w:val="bullet"/>
+      <w:lvlText w:val=""/>
+      <w:lvlJc w:val="left"/>
+      <w:pPr>
+        <w:ind w:left="720" w:hanging="360"/>
+      </w:pPr>
+      <w:rPr>
+        <w:rFonts w:ascii="Wingdings" w:hAnsi="Wingdings" w:hint="default"/>
+      </w:rPr>
+    </w:lvl>
+    <w:lvl w:ilvl="1" w:tplc="FFFFFFFF">
+      <w:start w:val="1"/>
+      <w:numFmt w:val="bullet"/>
+      <w:lvlText w:val="o"/>
+      <w:lvlJc w:val="left"/>
+      <w:pPr>
+        <w:ind w:left="1440" w:hanging="360"/>
+      </w:pPr>
+      <w:rPr>
+        <w:rFonts w:ascii="Courier New" w:hAnsi="Courier New" w:cs="Courier New" w:hint="default"/>
+      </w:rPr>
+    </w:lvl>
+    <w:lvl w:ilvl="2" w:tplc="FFFFFFFF" w:tentative="1">
+      <w:start w:val="1"/>
+      <w:numFmt w:val="bullet"/>
+      <w:lvlText w:val=""/>
+      <w:lvlJc w:val="left"/>
+      <w:pPr>
+        <w:ind w:left="2160" w:hanging="360"/>
+      </w:pPr>
+      <w:rPr>
+        <w:rFonts w:ascii="Wingdings" w:hAnsi="Wingdings" w:hint="default"/>
+      </w:rPr>
+    </w:lvl>
+    <w:lvl w:ilvl="3" w:tplc="FFFFFFFF" w:tentative="1">
+      <w:start w:val="1"/>
+      <w:numFmt w:val="bullet"/>
+      <w:lvlText w:val=""/>
+      <w:lvlJc w:val="left"/>
+      <w:pPr>
+        <w:ind w:left="2880" w:hanging="360"/>
+      </w:pPr>
+      <w:rPr>
+        <w:rFonts w:ascii="Symbol" w:hAnsi="Symbol" w:hint="default"/>
+      </w:rPr>
+    </w:lvl>
+    <w:lvl w:ilvl="4" w:tplc="FFFFFFFF" w:tentative="1">
+      <w:start w:val="1"/>
+      <w:numFmt w:val="bullet"/>
+      <w:lvlText w:val="o"/>
+      <w:lvlJc w:val="left"/>
+      <w:pPr>
+        <w:ind w:left="3600" w:hanging="360"/>
+      </w:pPr>
+      <w:rPr>
+        <w:rFonts w:ascii="Courier New" w:hAnsi="Courier New" w:cs="Courier New" w:hint="default"/>
+      </w:rPr>
+    </w:lvl>
+    <w:lvl w:ilvl="5" w:tplc="FFFFFFFF" w:tentative="1">
+      <w:start w:val="1"/>
+      <w:numFmt w:val="bullet"/>
+      <w:lvlText w:val=""/>
+      <w:lvlJc w:val="left"/>
+      <w:pPr>
+        <w:ind w:left="4320" w:hanging="360"/>
+      </w:pPr>
+      <w:rPr>
+        <w:rFonts w:ascii="Wingdings" w:hAnsi="Wingdings" w:hint="default"/>
+      </w:rPr>
+    </w:lvl>
+    <w:lvl w:ilvl="6" w:tplc="FFFFFFFF" w:tentative="1">
+      <w:start w:val="1"/>
+      <w:numFmt w:val="bullet"/>
+      <w:lvlText w:val=""/>
+      <w:lvlJc w:val="left"/>
+      <w:pPr>
+        <w:ind w:left="5040" w:hanging="360"/>
+      </w:pPr>
+      <w:rPr>
+        <w:rFonts w:ascii="Symbol" w:hAnsi="Symbol" w:hint="default"/>
+      </w:rPr>
+    </w:lvl>
+    <w:lvl w:ilvl="7" w:tplc="FFFFFFFF" w:tentative="1">
+      <w:start w:val="1"/>
+      <w:numFmt w:val="bullet"/>
+      <w:lvlText w:val="o"/>
+      <w:lvlJc w:val="left"/>
+      <w:pPr>
+        <w:ind w:left="5760" w:hanging="360"/>
+      </w:pPr>
+      <w:rPr>
+        <w:rFonts w:ascii="Courier New" w:hAnsi="Courier New" w:cs="Courier New" w:hint="default"/>
+      </w:rPr>
+    </w:lvl>
+    <w:lvl w:ilvl="8" w:tplc="FFFFFFFF" w:tentative="1">
+      <w:start w:val="1"/>
+      <w:numFmt w:val="bullet"/>
+      <w:lvlText w:val=""/>
+      <w:lvlJc w:val="left"/>
+      <w:pPr>
+        <w:ind w:left="6480" w:hanging="360"/>
+      </w:pPr>
+      <w:rPr>
+        <w:rFonts w:ascii="Wingdings" w:hAnsi="Wingdings" w:hint="default"/>
+      </w:rPr>
+    </w:lvl>
+  </w:abstractNum>
+  <w:abstractNum w:abstractNumId="5" w15:restartNumberingAfterBreak="0">
     <w:nsid w:val="2F0C0B3A"/>
     <w:multiLevelType w:val="multilevel"/>
     <w:tmpl w:val="D688AC54"/>
@@ -2667,7 +2783,7 @@
       </w:rPr>
     </w:lvl>
   </w:abstractNum>
-  <w:abstractNum w:abstractNumId="4" w15:restartNumberingAfterBreak="0">
+  <w:abstractNum w:abstractNumId="6" w15:restartNumberingAfterBreak="0">
     <w:nsid w:val="4CAA4E96"/>
     <w:multiLevelType w:val="hybridMultilevel"/>
     <w:tmpl w:val="5A364392"/>
@@ -2780,7 +2896,7 @@
       </w:rPr>
     </w:lvl>
   </w:abstractNum>
-  <w:abstractNum w:abstractNumId="5" w15:restartNumberingAfterBreak="0">
+  <w:abstractNum w:abstractNumId="7" w15:restartNumberingAfterBreak="0">
     <w:nsid w:val="6635512A"/>
     <w:multiLevelType w:val="hybridMultilevel"/>
     <w:tmpl w:val="1B26F91E"/>
@@ -2893,7 +3009,7 @@
       </w:rPr>
     </w:lvl>
   </w:abstractNum>
-  <w:abstractNum w:abstractNumId="6" w15:restartNumberingAfterBreak="0">
+  <w:abstractNum w:abstractNumId="8" w15:restartNumberingAfterBreak="0">
     <w:nsid w:val="6AE64184"/>
     <w:multiLevelType w:val="hybridMultilevel"/>
     <w:tmpl w:val="52A85266"/>
@@ -2909,7 +3025,7 @@
         <w:rFonts w:ascii="Symbol" w:hAnsi="Symbol" w:hint="default"/>
       </w:rPr>
     </w:lvl>
-    <w:lvl w:ilvl="1" w:tplc="04090003" w:tentative="1">
+    <w:lvl w:ilvl="1" w:tplc="04090003">
       <w:start w:val="1"/>
       <w:numFmt w:val="bullet"/>
       <w:lvlText w:val="o"/>
@@ -3006,7 +3122,156 @@
       </w:rPr>
     </w:lvl>
   </w:abstractNum>
-  <w:abstractNum w:abstractNumId="7" w15:restartNumberingAfterBreak="0">
+  <w:abstractNum w:abstractNumId="9" w15:restartNumberingAfterBreak="0">
+    <w:nsid w:val="6C166325"/>
+    <w:multiLevelType w:val="multilevel"/>
+    <w:tmpl w:val="C1A69358"/>
+    <w:lvl w:ilvl="0">
+      <w:start w:val="1"/>
+      <w:numFmt w:val="bullet"/>
+      <w:lvlText w:val=""/>
+      <w:lvlJc w:val="left"/>
+      <w:pPr>
+        <w:tabs>
+          <w:tab w:val="num" w:pos="720"/>
+        </w:tabs>
+        <w:ind w:left="720" w:hanging="360"/>
+      </w:pPr>
+      <w:rPr>
+        <w:rFonts w:ascii="Symbol" w:hAnsi="Symbol" w:hint="default"/>
+        <w:sz w:val="20"/>
+      </w:rPr>
+    </w:lvl>
+    <w:lvl w:ilvl="1" w:tentative="1">
+      <w:start w:val="1"/>
+      <w:numFmt w:val="bullet"/>
+      <w:lvlText w:val="o"/>
+      <w:lvlJc w:val="left"/>
+      <w:pPr>
+        <w:tabs>
+          <w:tab w:val="num" w:pos="1440"/>
+        </w:tabs>
+        <w:ind w:left="1440" w:hanging="360"/>
+      </w:pPr>
+      <w:rPr>
+        <w:rFonts w:ascii="Courier New" w:hAnsi="Courier New" w:hint="default"/>
+        <w:sz w:val="20"/>
+      </w:rPr>
+    </w:lvl>
+    <w:lvl w:ilvl="2" w:tentative="1">
+      <w:start w:val="1"/>
+      <w:numFmt w:val="bullet"/>
+      <w:lvlText w:val=""/>
+      <w:lvlJc w:val="left"/>
+      <w:pPr>
+        <w:tabs>
+          <w:tab w:val="num" w:pos="2160"/>
+        </w:tabs>
+        <w:ind w:left="2160" w:hanging="360"/>
+      </w:pPr>
+      <w:rPr>
+        <w:rFonts w:ascii="Wingdings" w:hAnsi="Wingdings" w:hint="default"/>
+        <w:sz w:val="20"/>
+      </w:rPr>
+    </w:lvl>
+    <w:lvl w:ilvl="3" w:tentative="1">
+      <w:start w:val="1"/>
+      <w:numFmt w:val="bullet"/>
+      <w:lvlText w:val=""/>
+      <w:lvlJc w:val="left"/>
+      <w:pPr>
+        <w:tabs>
+          <w:tab w:val="num" w:pos="2880"/>
+        </w:tabs>
+        <w:ind w:left="2880" w:hanging="360"/>
+      </w:pPr>
+      <w:rPr>
+        <w:rFonts w:ascii="Wingdings" w:hAnsi="Wingdings" w:hint="default"/>
+        <w:sz w:val="20"/>
+      </w:rPr>
+    </w:lvl>
+    <w:lvl w:ilvl="4" w:tentative="1">
+      <w:start w:val="1"/>
+      <w:numFmt w:val="bullet"/>
+      <w:lvlText w:val=""/>
+      <w:lvlJc w:val="left"/>
+      <w:pPr>
+        <w:tabs>
+          <w:tab w:val="num" w:pos="3600"/>
+        </w:tabs>
+        <w:ind w:left="3600" w:hanging="360"/>
+      </w:pPr>
+      <w:rPr>
+        <w:rFonts w:ascii="Wingdings" w:hAnsi="Wingdings" w:hint="default"/>
+        <w:sz w:val="20"/>
+      </w:rPr>
+    </w:lvl>
+    <w:lvl w:ilvl="5" w:tentative="1">
+      <w:start w:val="1"/>
+      <w:numFmt w:val="bullet"/>
+      <w:lvlText w:val=""/>
+      <w:lvlJc w:val="left"/>
+      <w:pPr>
+        <w:tabs>
+          <w:tab w:val="num" w:pos="4320"/>
+        </w:tabs>
+        <w:ind w:left="4320" w:hanging="360"/>
+      </w:pPr>
+      <w:rPr>
+        <w:rFonts w:ascii="Wingdings" w:hAnsi="Wingdings" w:hint="default"/>
+        <w:sz w:val="20"/>
+      </w:rPr>
+    </w:lvl>
+    <w:lvl w:ilvl="6" w:tentative="1">
+      <w:start w:val="1"/>
+      <w:numFmt w:val="bullet"/>
+      <w:lvlText w:val=""/>
+      <w:lvlJc w:val="left"/>
+      <w:pPr>
+        <w:tabs>
+          <w:tab w:val="num" w:pos="5040"/>
+        </w:tabs>
+        <w:ind w:left="5040" w:hanging="360"/>
+      </w:pPr>
+      <w:rPr>
+        <w:rFonts w:ascii="Wingdings" w:hAnsi="Wingdings" w:hint="default"/>
+        <w:sz w:val="20"/>
+      </w:rPr>
+    </w:lvl>
+    <w:lvl w:ilvl="7" w:tentative="1">
+      <w:start w:val="1"/>
+      <w:numFmt w:val="bullet"/>
+      <w:lvlText w:val=""/>
+      <w:lvlJc w:val="left"/>
+      <w:pPr>
+        <w:tabs>
+          <w:tab w:val="num" w:pos="5760"/>
+        </w:tabs>
+        <w:ind w:left="5760" w:hanging="360"/>
+      </w:pPr>
+      <w:rPr>
+        <w:rFonts w:ascii="Wingdings" w:hAnsi="Wingdings" w:hint="default"/>
+        <w:sz w:val="20"/>
+      </w:rPr>
+    </w:lvl>
+    <w:lvl w:ilvl="8" w:tentative="1">
+      <w:start w:val="1"/>
+      <w:numFmt w:val="bullet"/>
+      <w:lvlText w:val=""/>
+      <w:lvlJc w:val="left"/>
+      <w:pPr>
+        <w:tabs>
+          <w:tab w:val="num" w:pos="6480"/>
+        </w:tabs>
+        <w:ind w:left="6480" w:hanging="360"/>
+      </w:pPr>
+      <w:rPr>
+        <w:rFonts w:ascii="Wingdings" w:hAnsi="Wingdings" w:hint="default"/>
+        <w:sz w:val="20"/>
+      </w:rPr>
+    </w:lvl>
+  </w:abstractNum>
+  <w:abstractNum w:abstractNumId="10" w15:restartNumberingAfterBreak="0">
     <w:nsid w:val="7912044C"/>
     <w:multiLevelType w:val="hybridMultilevel"/>
     <w:tmpl w:val="F0E66E4C"/>
@@ -3120,7 +3385,7 @@
     </w:lvl>
   </w:abstractNum>
   <w:num w:numId="1" w16cid:durableId="1660618374">
-    <w:abstractNumId w:val="3"/>
+    <w:abstractNumId w:val="5"/>
   </w:num>
   <w:num w:numId="2" w16cid:durableId="1649432533">
     <w:abstractNumId w:val="0"/>
@@ -3129,25 +3394,34 @@
     <w:abstractNumId w:val="2"/>
   </w:num>
   <w:num w:numId="4" w16cid:durableId="854028915">
+    <w:abstractNumId w:val="10"/>
+  </w:num>
+  <w:num w:numId="5" w16cid:durableId="607004915">
+    <w:abstractNumId w:val="6"/>
+  </w:num>
+  <w:num w:numId="6" w16cid:durableId="423645271">
     <w:abstractNumId w:val="7"/>
   </w:num>
-  <w:num w:numId="5" w16cid:durableId="607004915">
-    <w:abstractNumId w:val="4"/>
-  </w:num>
-  <w:num w:numId="6" w16cid:durableId="423645271">
-    <w:abstractNumId w:val="5"/>
-  </w:num>
   <w:num w:numId="7" w16cid:durableId="537819586">
-    <w:abstractNumId w:val="6"/>
+    <w:abstractNumId w:val="8"/>
   </w:num>
   <w:num w:numId="8" w16cid:durableId="307981696">
     <w:abstractNumId w:val="1"/>
+  </w:num>
+  <w:num w:numId="9" w16cid:durableId="1991444021">
+    <w:abstractNumId w:val="3"/>
+  </w:num>
+  <w:num w:numId="10" w16cid:durableId="15040040">
+    <w:abstractNumId w:val="4"/>
+  </w:num>
+  <w:num w:numId="11" w16cid:durableId="360055810">
+    <w:abstractNumId w:val="9"/>
   </w:num>
 </w:numbering>
 </file>
 
 <file path=word/styles.xml><?xml version="1.0" encoding="utf-8"?>
-<w:styles xmlns:mc="http://schemas.openxmlformats.org/markup-compatibility/2006" xmlns:r="http://schemas.openxmlformats.org/officeDocument/2006/relationships" xmlns:w="http://schemas.openxmlformats.org/wordprocessingml/2006/main" xmlns:w14="http://schemas.microsoft.com/office/word/2010/wordml" xmlns:w15="http://schemas.microsoft.com/office/word/2012/wordml" xmlns:w16cex="http://schemas.microsoft.com/office/word/2018/wordml/cex" xmlns:w16cid="http://schemas.microsoft.com/office/word/2016/wordml/cid" xmlns:w16="http://schemas.microsoft.com/office/word/2018/wordml" xmlns:w16sdtdh="http://schemas.microsoft.com/office/word/2020/wordml/sdtdatahash" xmlns:w16se="http://schemas.microsoft.com/office/word/2015/wordml/symex" mc:Ignorable="w14 w15 w16se w16cid w16 w16cex w16sdtdh">
+<w:styles xmlns:mc="http://schemas.openxmlformats.org/markup-compatibility/2006" xmlns:r="http://schemas.openxmlformats.org/officeDocument/2006/relationships" xmlns:w="http://schemas.openxmlformats.org/wordprocessingml/2006/main" xmlns:w14="http://schemas.microsoft.com/office/word/2010/wordml" xmlns:w15="http://schemas.microsoft.com/office/word/2012/wordml" xmlns:w16cex="http://schemas.microsoft.com/office/word/2018/wordml/cex" xmlns:w16cid="http://schemas.microsoft.com/office/word/2016/wordml/cid" xmlns:w16="http://schemas.microsoft.com/office/word/2018/wordml" xmlns:w16du="http://schemas.microsoft.com/office/word/2023/wordml/word16du" xmlns:w16sdtdh="http://schemas.microsoft.com/office/word/2020/wordml/sdtdatahash" xmlns:w16sdtfl="http://schemas.microsoft.com/office/word/2024/wordml/sdtformatlock" xmlns:w16se="http://schemas.microsoft.com/office/word/2015/wordml/symex" mc:Ignorable="w14 w15 w16se w16cid w16 w16cex w16sdtdh w16sdtfl w16du">
   <w:docDefaults>
     <w:rPrDefault>
       <w:rPr>
@@ -3591,7 +3865,6 @@
   <w:style w:type="character" w:default="1" w:styleId="DefaultParagraphFont">
     <w:name w:val="Default Paragraph Font"/>
     <w:uiPriority w:val="1"/>
-    <w:semiHidden/>
     <w:unhideWhenUsed/>
   </w:style>
   <w:style w:type="table" w:default="1" w:styleId="TableNormal">

</xml_diff>